<commit_message>
Rebuild the website with advancement points
Co-Authored-By: Claude Opus 5.5 <noreply@anthropic.com>
Claude-Session: https://claude.ai/code/session_015SADCFzhKijkC2foUmXrpC
</commit_message>
<xml_diff>
--- a/legend-dynamics/site/core-rules/Legend_Dynamics_Core_Rules.docx
+++ b/legend-dynamics/site/core-rules/Legend_Dynamics_Core_Rules.docx
@@ -4363,20 +4363,832 @@
         <w:pStyle w:val="FirstParagraph"/>
       </w:pPr>
       <w:r>
-        <w:t xml:space="preserve">After a significant mission, a magical character can take one of these</w:t>
-      </w:r>
-      <w:r>
-        <w:t xml:space="preserve"> </w:t>
-      </w:r>
-      <w:r>
-        <w:rPr>
-          <w:bCs/>
-          <w:b/>
-        </w:rPr>
-        <w:t xml:space="preserve">instead of a skill step</w:t>
-      </w:r>
-      <w:r>
-        <w:t xml:space="preserve">, with the GM’s approval and a reason from the story. Each setting says which it uses.</w:t>
+        <w:t xml:space="preserve">A magical character can spend advancement points (see</w:t>
+      </w:r>
+      <w:r>
+        <w:t xml:space="preserve"> </w:t>
+      </w:r>
+      <w:r>
+        <w:rPr>
+          <w:iCs/>
+          <w:i/>
+        </w:rPr>
+        <w:t xml:space="preserve">Advancement</w:t>
+      </w:r>
+      <w:r>
+        <w:t xml:space="preserve">) on these, with the GM’s approval and a reason from the story. Each setting says which it uses.</w:t>
+      </w:r>
+    </w:p>
+    <w:tbl>
+      <w:tblPr>
+        <w:tblStyle w:val="Table"/>
+        <w:tblW w:type="pct" w:w="5000"/>
+        <w:tblLook w:firstRow="1" w:lastRow="0" w:firstColumn="0" w:lastColumn="0" w:noHBand="0" w:noVBand="0" w:val="0020"/>
+        <w:jc w:val="start"/>
+        <w:tblBorders>
+          <w:top w:val="single" w:sz="4" w:color="B8C2D3"/>
+          <w:left w:val="single" w:sz="4" w:color="B8C2D3"/>
+          <w:bottom w:val="single" w:sz="4" w:color="B8C2D3"/>
+          <w:right w:val="single" w:sz="4" w:color="B8C2D3"/>
+          <w:insideH w:val="single" w:sz="4" w:color="B8C2D3"/>
+          <w:insideV w:val="single" w:sz="4" w:color="B8C2D3"/>
+        </w:tblBorders>
+      </w:tblPr>
+      <w:tblGrid>
+        <w:gridCol w:w="1980"/>
+        <w:gridCol w:w="1980"/>
+        <w:gridCol w:w="1980"/>
+        <w:gridCol w:w="1980"/>
+      </w:tblGrid>
+      <w:tr>
+        <w:trPr>
+          <w:tblHeader w:val="true"/>
+        </w:trPr>
+        <w:tc>
+          <w:tcPr>
+            <w:shd w:val="clear" w:fill="E9EEF6"/>
+          </w:tcPr>
+          <w:p>
+            <w:pPr>
+              <w:pStyle w:val="Compact"/>
+              <w:jc w:val="left"/>
+            </w:pPr>
+            <w:r>
+              <w:rPr>
+                <w:b/>
+                <w:sz w:val="19"/>
+              </w:rPr>
+              <w:t xml:space="preserve">Option</w:t>
+            </w:r>
+          </w:p>
+        </w:tc>
+        <w:tc>
+          <w:tcPr>
+            <w:shd w:val="clear" w:fill="E9EEF6"/>
+          </w:tcPr>
+          <w:p>
+            <w:pPr>
+              <w:pStyle w:val="Compact"/>
+              <w:jc w:val="left"/>
+            </w:pPr>
+            <w:r>
+              <w:rPr>
+                <w:b/>
+                <w:sz w:val="19"/>
+              </w:rPr>
+              <w:t xml:space="preserve">Effect</w:t>
+            </w:r>
+          </w:p>
+        </w:tc>
+        <w:tc>
+          <w:tcPr>
+            <w:shd w:val="clear" w:fill="E9EEF6"/>
+          </w:tcPr>
+          <w:p>
+            <w:pPr>
+              <w:pStyle w:val="Compact"/>
+              <w:jc w:val="left"/>
+            </w:pPr>
+            <w:r>
+              <w:rPr>
+                <w:b/>
+                <w:sz w:val="19"/>
+              </w:rPr>
+              <w:t xml:space="preserve">Cost</w:t>
+            </w:r>
+          </w:p>
+        </w:tc>
+        <w:tc>
+          <w:tcPr>
+            <w:shd w:val="clear" w:fill="E9EEF6"/>
+          </w:tcPr>
+          <w:p>
+            <w:pPr>
+              <w:pStyle w:val="Compact"/>
+              <w:jc w:val="left"/>
+            </w:pPr>
+            <w:r>
+              <w:rPr>
+                <w:b/>
+                <w:sz w:val="19"/>
+              </w:rPr>
+              <w:t xml:space="preserve">Limit</w:t>
+            </w:r>
+          </w:p>
+        </w:tc>
+      </w:tr>
+      <w:tr>
+        <w:tc>
+          <w:tcPr/>
+          <w:p>
+            <w:pPr>
+              <w:pStyle w:val="Compact"/>
+              <w:jc w:val="left"/>
+            </w:pPr>
+            <w:r>
+              <w:rPr>
+                <w:b/>
+                <w:sz w:val="19"/>
+              </w:rPr>
+              <w:t xml:space="preserve">New burst</w:t>
+            </w:r>
+          </w:p>
+        </w:tc>
+        <w:tc>
+          <w:tcPr/>
+          <w:p>
+            <w:pPr>
+              <w:pStyle w:val="Compact"/>
+              <w:jc w:val="left"/>
+            </w:pPr>
+            <w:r>
+              <w:rPr>
+                <w:sz w:val="19"/>
+              </w:rPr>
+              <w:t xml:space="preserve">Learn one burst beyond your limit</w:t>
+            </w:r>
+          </w:p>
+        </w:tc>
+        <w:tc>
+          <w:tcPr/>
+          <w:p>
+            <w:pPr>
+              <w:pStyle w:val="Compact"/>
+              <w:jc w:val="left"/>
+            </w:pPr>
+            <w:r>
+              <w:rPr>
+                <w:sz w:val="19"/>
+              </w:rPr>
+              <w:t xml:space="preserve">1</w:t>
+            </w:r>
+          </w:p>
+        </w:tc>
+        <w:tc>
+          <w:tcPr/>
+          <w:p>
+            <w:pPr>
+              <w:pStyle w:val="Compact"/>
+              <w:jc w:val="left"/>
+            </w:pPr>
+            <w:r>
+              <w:rPr>
+                <w:sz w:val="19"/>
+              </w:rPr>
+              <w:t xml:space="preserve">Up to 2 extra</w:t>
+            </w:r>
+          </w:p>
+        </w:tc>
+      </w:tr>
+      <w:tr>
+        <w:tc>
+          <w:tcPr/>
+          <w:p>
+            <w:pPr>
+              <w:pStyle w:val="Compact"/>
+              <w:jc w:val="left"/>
+            </w:pPr>
+            <w:r>
+              <w:rPr>
+                <w:b/>
+                <w:sz w:val="19"/>
+              </w:rPr>
+              <w:t xml:space="preserve">Deeper step</w:t>
+            </w:r>
+          </w:p>
+        </w:tc>
+        <w:tc>
+          <w:tcPr/>
+          <w:p>
+            <w:pPr>
+              <w:pStyle w:val="Compact"/>
+              <w:jc w:val="left"/>
+            </w:pPr>
+            <w:r>
+              <w:rPr>
+                <w:sz w:val="19"/>
+              </w:rPr>
+              <w:t xml:space="preserve">One burst you know works one step deeper: one more Boost</w:t>
+            </w:r>
+          </w:p>
+        </w:tc>
+        <w:tc>
+          <w:tcPr/>
+          <w:p>
+            <w:pPr>
+              <w:pStyle w:val="Compact"/>
+              <w:jc w:val="left"/>
+            </w:pPr>
+            <w:r>
+              <w:rPr>
+                <w:sz w:val="19"/>
+              </w:rPr>
+              <w:t xml:space="preserve">2</w:t>
+            </w:r>
+          </w:p>
+        </w:tc>
+        <w:tc>
+          <w:tcPr/>
+          <w:p>
+            <w:pPr>
+              <w:pStyle w:val="Compact"/>
+              <w:jc w:val="left"/>
+            </w:pPr>
+            <w:r>
+              <w:rPr>
+                <w:sz w:val="19"/>
+              </w:rPr>
+              <w:t xml:space="preserve">Each burst once</w:t>
+            </w:r>
+          </w:p>
+        </w:tc>
+      </w:tr>
+      <w:tr>
+        <w:tc>
+          <w:tcPr/>
+          <w:p>
+            <w:pPr>
+              <w:pStyle w:val="Compact"/>
+              <w:jc w:val="left"/>
+            </w:pPr>
+            <w:r>
+              <w:rPr>
+                <w:b/>
+                <w:sz w:val="19"/>
+              </w:rPr>
+              <w:t xml:space="preserve">Another charm</w:t>
+            </w:r>
+          </w:p>
+        </w:tc>
+        <w:tc>
+          <w:tcPr/>
+          <w:p>
+            <w:pPr>
+              <w:pStyle w:val="Compact"/>
+              <w:jc w:val="left"/>
+            </w:pPr>
+            <w:r>
+              <w:rPr>
+                <w:sz w:val="19"/>
+              </w:rPr>
+              <w:t xml:space="preserve">Carry one more ready charm</w:t>
+            </w:r>
+          </w:p>
+        </w:tc>
+        <w:tc>
+          <w:tcPr/>
+          <w:p>
+            <w:pPr>
+              <w:pStyle w:val="Compact"/>
+              <w:jc w:val="left"/>
+            </w:pPr>
+            <w:r>
+              <w:rPr>
+                <w:sz w:val="19"/>
+              </w:rPr>
+              <w:t xml:space="preserve">1</w:t>
+            </w:r>
+          </w:p>
+        </w:tc>
+        <w:tc>
+          <w:tcPr/>
+          <w:p>
+            <w:pPr>
+              <w:pStyle w:val="Compact"/>
+              <w:jc w:val="left"/>
+            </w:pPr>
+            <w:r>
+              <w:rPr>
+                <w:sz w:val="19"/>
+              </w:rPr>
+              <w:t xml:space="preserve">Up to 2 extra</w:t>
+            </w:r>
+          </w:p>
+        </w:tc>
+      </w:tr>
+      <w:tr>
+        <w:tc>
+          <w:tcPr/>
+          <w:p>
+            <w:pPr>
+              <w:pStyle w:val="Compact"/>
+              <w:jc w:val="left"/>
+            </w:pPr>
+            <w:r>
+              <w:rPr>
+                <w:b/>
+                <w:sz w:val="19"/>
+              </w:rPr>
+              <w:t xml:space="preserve">By heart</w:t>
+            </w:r>
+          </w:p>
+        </w:tc>
+        <w:tc>
+          <w:tcPr/>
+          <w:p>
+            <w:pPr>
+              <w:pStyle w:val="Compact"/>
+              <w:jc w:val="left"/>
+            </w:pPr>
+            <w:r>
+              <w:rPr>
+                <w:sz w:val="19"/>
+              </w:rPr>
+              <w:t xml:space="preserve">One kind of working takes one fewer segment (minimum 1)</w:t>
+            </w:r>
+          </w:p>
+        </w:tc>
+        <w:tc>
+          <w:tcPr/>
+          <w:p>
+            <w:pPr>
+              <w:pStyle w:val="Compact"/>
+              <w:jc w:val="left"/>
+            </w:pPr>
+            <w:r>
+              <w:rPr>
+                <w:sz w:val="19"/>
+              </w:rPr>
+              <w:t xml:space="preserve">1</w:t>
+            </w:r>
+          </w:p>
+        </w:tc>
+        <w:tc>
+          <w:tcPr/>
+          <w:p>
+            <w:pPr>
+              <w:pStyle w:val="Compact"/>
+              <w:jc w:val="left"/>
+            </w:pPr>
+            <w:r>
+              <w:rPr>
+                <w:sz w:val="19"/>
+              </w:rPr>
+              <w:t xml:space="preserve">Each kind once</w:t>
+            </w:r>
+          </w:p>
+        </w:tc>
+      </w:tr>
+      <w:tr>
+        <w:tc>
+          <w:tcPr/>
+          <w:p>
+            <w:pPr>
+              <w:pStyle w:val="Compact"/>
+              <w:jc w:val="left"/>
+            </w:pPr>
+            <w:r>
+              <w:rPr>
+                <w:b/>
+                <w:sz w:val="19"/>
+              </w:rPr>
+              <w:t xml:space="preserve">Quicker hand</w:t>
+            </w:r>
+          </w:p>
+        </w:tc>
+        <w:tc>
+          <w:tcPr/>
+          <w:p>
+            <w:pPr>
+              <w:pStyle w:val="Compact"/>
+              <w:jc w:val="left"/>
+            </w:pPr>
+            <w:r>
+              <w:rPr>
+                <w:sz w:val="19"/>
+              </w:rPr>
+              <w:t xml:space="preserve">One working you know goes one pace faster: an hour becomes ten minutes, ten minutes one action</w:t>
+            </w:r>
+          </w:p>
+        </w:tc>
+        <w:tc>
+          <w:tcPr/>
+          <w:p>
+            <w:pPr>
+              <w:pStyle w:val="Compact"/>
+              <w:jc w:val="left"/>
+            </w:pPr>
+            <w:r>
+              <w:rPr>
+                <w:sz w:val="19"/>
+              </w:rPr>
+              <w:t xml:space="preserve">1</w:t>
+            </w:r>
+          </w:p>
+        </w:tc>
+        <w:tc>
+          <w:tcPr/>
+          <w:p>
+            <w:pPr>
+              <w:pStyle w:val="Compact"/>
+              <w:jc w:val="left"/>
+            </w:pPr>
+            <w:r>
+              <w:rPr>
+                <w:sz w:val="19"/>
+              </w:rPr>
+              <w:t xml:space="preserve">Each working once</w:t>
+            </w:r>
+          </w:p>
+        </w:tc>
+      </w:tr>
+      <w:tr>
+        <w:tc>
+          <w:tcPr/>
+          <w:p>
+            <w:pPr>
+              <w:pStyle w:val="Compact"/>
+              <w:jc w:val="left"/>
+            </w:pPr>
+            <w:r>
+              <w:rPr>
+                <w:b/>
+                <w:sz w:val="19"/>
+              </w:rPr>
+              <w:t xml:space="preserve">Mastery</w:t>
+            </w:r>
+          </w:p>
+        </w:tc>
+        <w:tc>
+          <w:tcPr/>
+          <w:p>
+            <w:pPr>
+              <w:pStyle w:val="Compact"/>
+              <w:jc w:val="left"/>
+            </w:pPr>
+            <w:r>
+              <w:rPr>
+                <w:sz w:val="19"/>
+              </w:rPr>
+              <w:t xml:space="preserve">Your magic skill becomes Expert (+5)</w:t>
+            </w:r>
+          </w:p>
+        </w:tc>
+        <w:tc>
+          <w:tcPr/>
+          <w:p>
+            <w:pPr>
+              <w:pStyle w:val="Compact"/>
+              <w:jc w:val="left"/>
+            </w:pPr>
+            <w:r>
+              <w:rPr>
+                <w:sz w:val="19"/>
+              </w:rPr>
+              <w:t xml:space="preserve">4</w:t>
+            </w:r>
+          </w:p>
+        </w:tc>
+        <w:tc>
+          <w:tcPr/>
+          <w:p>
+            <w:pPr>
+              <w:pStyle w:val="Compact"/>
+              <w:jc w:val="left"/>
+            </w:pPr>
+            <w:r>
+              <w:rPr>
+                <w:sz w:val="19"/>
+              </w:rPr>
+              <w:t xml:space="preserve">Once, at the end of a long campaign</w:t>
+            </w:r>
+          </w:p>
+        </w:tc>
+      </w:tr>
+    </w:tbl>
+    <w:bookmarkEnd w:id="65"/>
+    <w:bookmarkEnd w:id="66"/>
+    <w:bookmarkStart w:id="70" w:name="legend-points-and-tracks"/>
+    <w:p>
+      <w:pPr>
+        <w:pStyle w:val="Heading1"/>
+      </w:pPr>
+      <w:r>
+        <w:t xml:space="preserve">Legend points and tracks</w:t>
+      </w:r>
+    </w:p>
+    <w:bookmarkStart w:id="67" w:name="using-legend-points"/>
+    <w:p>
+      <w:pPr>
+        <w:pStyle w:val="Heading2"/>
+      </w:pPr>
+      <w:r>
+        <w:t xml:space="preserve">Using Legend points</w:t>
+      </w:r>
+    </w:p>
+    <w:p>
+      <w:pPr>
+        <w:pStyle w:val="FirstParagraph"/>
+      </w:pPr>
+      <w:r>
+        <w:t xml:space="preserve">Begin each session with two Legend points (three with Extra Legend); unused points do not carry over. Spend no more than one point on a single roll or injury event.</w:t>
+      </w:r>
+    </w:p>
+    <w:tbl>
+      <w:tblPr>
+        <w:tblStyle w:val="Table"/>
+        <w:tblW w:type="pct" w:w="5000"/>
+        <w:tblLook w:firstRow="1" w:lastRow="0" w:firstColumn="0" w:lastColumn="0" w:noHBand="0" w:noVBand="0" w:val="0020"/>
+        <w:jc w:val="start"/>
+        <w:tblBorders>
+          <w:top w:val="single" w:sz="4" w:color="B8C2D3"/>
+          <w:left w:val="single" w:sz="4" w:color="B8C2D3"/>
+          <w:bottom w:val="single" w:sz="4" w:color="B8C2D3"/>
+          <w:right w:val="single" w:sz="4" w:color="B8C2D3"/>
+          <w:insideH w:val="single" w:sz="4" w:color="B8C2D3"/>
+          <w:insideV w:val="single" w:sz="4" w:color="B8C2D3"/>
+        </w:tblBorders>
+      </w:tblPr>
+      <w:tblGrid>
+        <w:gridCol w:w="3960"/>
+        <w:gridCol w:w="3960"/>
+      </w:tblGrid>
+      <w:tr>
+        <w:trPr>
+          <w:tblHeader w:val="true"/>
+        </w:trPr>
+        <w:tc>
+          <w:tcPr>
+            <w:shd w:val="clear" w:fill="E9EEF6"/>
+          </w:tcPr>
+          <w:p>
+            <w:pPr>
+              <w:pStyle w:val="Compact"/>
+              <w:jc w:val="left"/>
+            </w:pPr>
+            <w:r>
+              <w:rPr>
+                <w:b/>
+                <w:sz w:val="19"/>
+              </w:rPr>
+              <w:t xml:space="preserve">Spend one point to</w:t>
+            </w:r>
+          </w:p>
+        </w:tc>
+        <w:tc>
+          <w:tcPr>
+            <w:shd w:val="clear" w:fill="E9EEF6"/>
+          </w:tcPr>
+          <w:p>
+            <w:pPr>
+              <w:pStyle w:val="Compact"/>
+              <w:jc w:val="left"/>
+            </w:pPr>
+            <w:r>
+              <w:rPr>
+                <w:b/>
+                <w:sz w:val="19"/>
+              </w:rPr>
+              <w:t xml:space="preserve">Timing and limits</w:t>
+            </w:r>
+          </w:p>
+        </w:tc>
+      </w:tr>
+      <w:tr>
+        <w:tc>
+          <w:tcPr/>
+          <w:p>
+            <w:pPr>
+              <w:pStyle w:val="Compact"/>
+              <w:jc w:val="left"/>
+            </w:pPr>
+            <w:r>
+              <w:rPr>
+                <w:b/>
+                <w:sz w:val="19"/>
+              </w:rPr>
+              <w:t xml:space="preserve">Reroll your own roll</w:t>
+            </w:r>
+          </w:p>
+        </w:tc>
+        <w:tc>
+          <w:tcPr/>
+          <w:p>
+            <w:pPr>
+              <w:pStyle w:val="Compact"/>
+              <w:jc w:val="left"/>
+            </w:pPr>
+            <w:r>
+              <w:rPr>
+                <w:sz w:val="19"/>
+              </w:rPr>
+              <w:t xml:space="preserve">Declare after seeing the result but before its consequences. Keep the second result, even if worse.</w:t>
+            </w:r>
+          </w:p>
+        </w:tc>
+      </w:tr>
+      <w:tr>
+        <w:tc>
+          <w:tcPr/>
+          <w:p>
+            <w:pPr>
+              <w:pStyle w:val="Compact"/>
+              <w:jc w:val="left"/>
+            </w:pPr>
+            <w:r>
+              <w:rPr>
+                <w:b/>
+                <w:sz w:val="19"/>
+              </w:rPr>
+              <w:t xml:space="preserve">Reduce an injury by one box</w:t>
+            </w:r>
+          </w:p>
+        </w:tc>
+        <w:tc>
+          <w:tcPr/>
+          <w:p>
+            <w:pPr>
+              <w:pStyle w:val="Compact"/>
+              <w:jc w:val="left"/>
+            </w:pPr>
+            <w:r>
+              <w:rPr>
+                <w:sz w:val="19"/>
+              </w:rPr>
+              <w:t xml:space="preserve">Declare when a hit would mark boxes, before applying them. Does not prevent certain death.</w:t>
+            </w:r>
+          </w:p>
+        </w:tc>
+      </w:tr>
+      <w:tr>
+        <w:tc>
+          <w:tcPr/>
+          <w:p>
+            <w:pPr>
+              <w:pStyle w:val="Compact"/>
+              <w:jc w:val="left"/>
+            </w:pPr>
+            <w:r>
+              <w:rPr>
+                <w:b/>
+                <w:sz w:val="19"/>
+              </w:rPr>
+              <w:t xml:space="preserve">Establish a small preparation</w:t>
+            </w:r>
+          </w:p>
+        </w:tc>
+        <w:tc>
+          <w:tcPr/>
+          <w:p>
+            <w:pPr>
+              <w:pStyle w:val="Compact"/>
+              <w:jc w:val="left"/>
+            </w:pPr>
+            <w:r>
+              <w:rPr>
+                <w:sz w:val="19"/>
+              </w:rPr>
+              <w:t xml:space="preserve">Propose a plausible detail, such as having packed something useful. GM approval is required.</w:t>
+            </w:r>
+          </w:p>
+        </w:tc>
+      </w:tr>
+    </w:tbl>
+    <w:p>
+      <w:pPr>
+        <w:pStyle w:val="BodyText"/>
+      </w:pPr>
+      <w:r>
+        <w:t xml:space="preserve">Gain one point when one of your complications creates a meaningful problem you accept, including a companion complication. You can decline the proposed complication without penalty.</w:t>
+      </w:r>
+    </w:p>
+    <w:bookmarkEnd w:id="67"/>
+    <w:bookmarkStart w:id="68" w:name="tracks"/>
+    <w:p>
+      <w:pPr>
+        <w:pStyle w:val="Heading2"/>
+      </w:pPr>
+      <w:r>
+        <w:t xml:space="preserve">Tracks</w:t>
+      </w:r>
+    </w:p>
+    <w:p>
+      <w:pPr>
+        <w:pStyle w:val="FirstParagraph"/>
+      </w:pPr>
+      <w:r>
+        <w:rPr>
+          <w:iCs/>
+          <w:i/>
+        </w:rPr>
+        <w:t xml:space="preserve">Your setting pack supplies this (tracks).</w:t>
+      </w:r>
+    </w:p>
+    <w:bookmarkEnd w:id="68"/>
+    <w:bookmarkStart w:id="69" w:name="advancement"/>
+    <w:p>
+      <w:pPr>
+        <w:pStyle w:val="Heading2"/>
+      </w:pPr>
+      <w:r>
+        <w:t xml:space="preserve">Advancement</w:t>
+      </w:r>
+    </w:p>
+    <w:p>
+      <w:pPr>
+        <w:pStyle w:val="FirstParagraph"/>
+      </w:pPr>
+      <w:r>
+        <w:t xml:space="preserve">Characters grow by earning</w:t>
+      </w:r>
+      <w:r>
+        <w:t xml:space="preserve"> </w:t>
+      </w:r>
+      <w:r>
+        <w:rPr>
+          <w:bCs/>
+          <w:b/>
+        </w:rPr>
+        <w:t xml:space="preserve">advancement points</w:t>
+      </w:r>
+      <w:r>
+        <w:t xml:space="preserve"> </w:t>
+      </w:r>
+      <w:r>
+        <w:t xml:space="preserve">and spending them.</w:t>
+      </w:r>
+    </w:p>
+    <w:p>
+      <w:pPr>
+        <w:numPr>
+          <w:ilvl w:val="0"/>
+          <w:numId w:val="1008"/>
+        </w:numPr>
+        <w:pStyle w:val="Compact"/>
+      </w:pPr>
+      <w:r>
+        <w:rPr>
+          <w:bCs/>
+          <w:b/>
+        </w:rPr>
+        <w:t xml:space="preserve">Earning.</w:t>
+      </w:r>
+      <w:r>
+        <w:t xml:space="preserve"> </w:t>
+      </w:r>
+      <w:r>
+        <w:t xml:space="preserve">After a significant mission, the GM awards each character</w:t>
+      </w:r>
+      <w:r>
+        <w:t xml:space="preserve"> </w:t>
+      </w:r>
+      <w:r>
+        <w:rPr>
+          <w:bCs/>
+          <w:b/>
+        </w:rPr>
+        <w:t xml:space="preserve">1 point</w:t>
+      </w:r>
+      <w:r>
+        <w:t xml:space="preserve">. At a</w:t>
+      </w:r>
+      <w:r>
+        <w:t xml:space="preserve"> </w:t>
+      </w:r>
+      <w:r>
+        <w:rPr>
+          <w:bCs/>
+          <w:b/>
+        </w:rPr>
+        <w:t xml:space="preserve">milestone</w:t>
+      </w:r>
+      <w:r>
+        <w:t xml:space="preserve">, the end of a story arc, everyone earns</w:t>
+      </w:r>
+      <w:r>
+        <w:t xml:space="preserve"> </w:t>
+      </w:r>
+      <w:r>
+        <w:rPr>
+          <w:bCs/>
+          <w:b/>
+        </w:rPr>
+        <w:t xml:space="preserve">2 more</w:t>
+      </w:r>
+      <w:r>
+        <w:t xml:space="preserve">.</w:t>
+      </w:r>
+    </w:p>
+    <w:p>
+      <w:pPr>
+        <w:numPr>
+          <w:ilvl w:val="0"/>
+          <w:numId w:val="1008"/>
+        </w:numPr>
+        <w:pStyle w:val="Compact"/>
+      </w:pPr>
+      <w:r>
+        <w:rPr>
+          <w:bCs/>
+          <w:b/>
+        </w:rPr>
+        <w:t xml:space="preserve">Spending.</w:t>
+      </w:r>
+      <w:r>
+        <w:t xml:space="preserve"> </w:t>
+      </w:r>
+      <w:r>
+        <w:t xml:space="preserve">Spend points when you earn them, or bank them for something bigger. Each purchase needs the GM’s approval and a reason from the story: training with someone, something you lived through, a debt paid.</w:t>
       </w:r>
     </w:p>
     <w:tbl>
@@ -4417,7 +5229,7 @@
                 <w:b/>
                 <w:sz w:val="19"/>
               </w:rPr>
-              <w:t xml:space="preserve">Option</w:t>
+              <w:t xml:space="preserve">Purchase</w:t>
             </w:r>
           </w:p>
         </w:tc>
@@ -4435,7 +5247,7 @@
                 <w:b/>
                 <w:sz w:val="19"/>
               </w:rPr>
-              <w:t xml:space="preserve">Effect</w:t>
+              <w:t xml:space="preserve">Cost</w:t>
             </w:r>
           </w:p>
         </w:tc>
@@ -4471,37 +5283,37 @@
                 <w:b/>
                 <w:sz w:val="19"/>
               </w:rPr>
-              <w:t xml:space="preserve">New burst</w:t>
-            </w:r>
-          </w:p>
-        </w:tc>
-        <w:tc>
-          <w:tcPr/>
-          <w:p>
-            <w:pPr>
-              <w:pStyle w:val="Compact"/>
-              <w:jc w:val="left"/>
-            </w:pPr>
-            <w:r>
-              <w:rPr>
-                <w:sz w:val="19"/>
-              </w:rPr>
-              <w:t xml:space="preserve">Learn one burst beyond your limit</w:t>
-            </w:r>
-          </w:p>
-        </w:tc>
-        <w:tc>
-          <w:tcPr/>
-          <w:p>
-            <w:pPr>
-              <w:pStyle w:val="Compact"/>
-              <w:jc w:val="left"/>
-            </w:pPr>
-            <w:r>
-              <w:rPr>
-                <w:sz w:val="19"/>
-              </w:rPr>
-              <w:t xml:space="preserve">Up to 2 extra</w:t>
+              <w:t xml:space="preserve">A skill from Untrained to Trained</w:t>
+            </w:r>
+          </w:p>
+        </w:tc>
+        <w:tc>
+          <w:tcPr/>
+          <w:p>
+            <w:pPr>
+              <w:pStyle w:val="Compact"/>
+              <w:jc w:val="left"/>
+            </w:pPr>
+            <w:r>
+              <w:rPr>
+                <w:sz w:val="19"/>
+              </w:rPr>
+              <w:t xml:space="preserve">1</w:t>
+            </w:r>
+          </w:p>
+        </w:tc>
+        <w:tc>
+          <w:tcPr/>
+          <w:p>
+            <w:pPr>
+              <w:pStyle w:val="Compact"/>
+              <w:jc w:val="left"/>
+            </w:pPr>
+            <w:r>
+              <w:rPr>
+                <w:sz w:val="19"/>
+              </w:rPr>
+              <w:t xml:space="preserve">—</w:t>
             </w:r>
           </w:p>
         </w:tc>
@@ -4519,37 +5331,37 @@
                 <w:b/>
                 <w:sz w:val="19"/>
               </w:rPr>
-              <w:t xml:space="preserve">Deeper step</w:t>
-            </w:r>
-          </w:p>
-        </w:tc>
-        <w:tc>
-          <w:tcPr/>
-          <w:p>
-            <w:pPr>
-              <w:pStyle w:val="Compact"/>
-              <w:jc w:val="left"/>
-            </w:pPr>
-            <w:r>
-              <w:rPr>
-                <w:sz w:val="19"/>
-              </w:rPr>
-              <w:t xml:space="preserve">One burst you know works one step deeper: one more Boost</w:t>
-            </w:r>
-          </w:p>
-        </w:tc>
-        <w:tc>
-          <w:tcPr/>
-          <w:p>
-            <w:pPr>
-              <w:pStyle w:val="Compact"/>
-              <w:jc w:val="left"/>
-            </w:pPr>
-            <w:r>
-              <w:rPr>
-                <w:sz w:val="19"/>
-              </w:rPr>
-              <w:t xml:space="preserve">Each burst once</w:t>
+              <w:t xml:space="preserve">A skill from Trained to Specialty</w:t>
+            </w:r>
+          </w:p>
+        </w:tc>
+        <w:tc>
+          <w:tcPr/>
+          <w:p>
+            <w:pPr>
+              <w:pStyle w:val="Compact"/>
+              <w:jc w:val="left"/>
+            </w:pPr>
+            <w:r>
+              <w:rPr>
+                <w:sz w:val="19"/>
+              </w:rPr>
+              <w:t xml:space="preserve">2</w:t>
+            </w:r>
+          </w:p>
+        </w:tc>
+        <w:tc>
+          <w:tcPr/>
+          <w:p>
+            <w:pPr>
+              <w:pStyle w:val="Compact"/>
+              <w:jc w:val="left"/>
+            </w:pPr>
+            <w:r>
+              <w:rPr>
+                <w:sz w:val="19"/>
+              </w:rPr>
+              <w:t xml:space="preserve">Specialty (+3) is the ceiling: only a Specialist’s starting skill is Expert, unless they broaden (see Step 3)</w:t>
             </w:r>
           </w:p>
         </w:tc>
@@ -4567,37 +5379,37 @@
                 <w:b/>
                 <w:sz w:val="19"/>
               </w:rPr>
-              <w:t xml:space="preserve">Another charm</w:t>
-            </w:r>
-          </w:p>
-        </w:tc>
-        <w:tc>
-          <w:tcPr/>
-          <w:p>
-            <w:pPr>
-              <w:pStyle w:val="Compact"/>
-              <w:jc w:val="left"/>
-            </w:pPr>
-            <w:r>
-              <w:rPr>
-                <w:sz w:val="19"/>
-              </w:rPr>
-              <w:t xml:space="preserve">Carry one more ready charm</w:t>
-            </w:r>
-          </w:p>
-        </w:tc>
-        <w:tc>
-          <w:tcPr/>
-          <w:p>
-            <w:pPr>
-              <w:pStyle w:val="Compact"/>
-              <w:jc w:val="left"/>
-            </w:pPr>
-            <w:r>
-              <w:rPr>
-                <w:sz w:val="19"/>
-              </w:rPr>
-              <w:t xml:space="preserve">Up to 2 extra</w:t>
+              <w:t xml:space="preserve">Revise an advantage or complication</w:t>
+            </w:r>
+          </w:p>
+        </w:tc>
+        <w:tc>
+          <w:tcPr/>
+          <w:p>
+            <w:pPr>
+              <w:pStyle w:val="Compact"/>
+              <w:jc w:val="left"/>
+            </w:pPr>
+            <w:r>
+              <w:rPr>
+                <w:sz w:val="19"/>
+              </w:rPr>
+              <w:t xml:space="preserve">1</w:t>
+            </w:r>
+          </w:p>
+        </w:tc>
+        <w:tc>
+          <w:tcPr/>
+          <w:p>
+            <w:pPr>
+              <w:pStyle w:val="Compact"/>
+              <w:jc w:val="left"/>
+            </w:pPr>
+            <w:r>
+              <w:rPr>
+                <w:sz w:val="19"/>
+              </w:rPr>
+              <w:t xml:space="preserve">—</w:t>
             </w:r>
           </w:p>
         </w:tc>
@@ -4615,37 +5427,37 @@
                 <w:b/>
                 <w:sz w:val="19"/>
               </w:rPr>
-              <w:t xml:space="preserve">By heart</w:t>
-            </w:r>
-          </w:p>
-        </w:tc>
-        <w:tc>
-          <w:tcPr/>
-          <w:p>
-            <w:pPr>
-              <w:pStyle w:val="Compact"/>
-              <w:jc w:val="left"/>
-            </w:pPr>
-            <w:r>
-              <w:rPr>
-                <w:sz w:val="19"/>
-              </w:rPr>
-              <w:t xml:space="preserve">One kind of working takes one fewer segment (minimum 1)</w:t>
-            </w:r>
-          </w:p>
-        </w:tc>
-        <w:tc>
-          <w:tcPr/>
-          <w:p>
-            <w:pPr>
-              <w:pStyle w:val="Compact"/>
-              <w:jc w:val="left"/>
-            </w:pPr>
-            <w:r>
-              <w:rPr>
-                <w:sz w:val="19"/>
-              </w:rPr>
-              <w:t xml:space="preserve">Each kind once</w:t>
+              <w:t xml:space="preserve">A new Edge</w:t>
+            </w:r>
+          </w:p>
+        </w:tc>
+        <w:tc>
+          <w:tcPr/>
+          <w:p>
+            <w:pPr>
+              <w:pStyle w:val="Compact"/>
+              <w:jc w:val="left"/>
+            </w:pPr>
+            <w:r>
+              <w:rPr>
+                <w:sz w:val="19"/>
+              </w:rPr>
+              <w:t xml:space="preserve">3</w:t>
+            </w:r>
+          </w:p>
+        </w:tc>
+        <w:tc>
+          <w:tcPr/>
+          <w:p>
+            <w:pPr>
+              <w:pStyle w:val="Compact"/>
+              <w:jc w:val="left"/>
+            </w:pPr>
+            <w:r>
+              <w:rPr>
+                <w:sz w:val="19"/>
+              </w:rPr>
+              <w:t xml:space="preserve">Any Edge except the attribute and Trained-skill Edges, within its own limit</w:t>
             </w:r>
           </w:p>
         </w:tc>
@@ -4663,324 +5475,48 @@
                 <w:b/>
                 <w:sz w:val="19"/>
               </w:rPr>
-              <w:t xml:space="preserve">Quicker hand</w:t>
-            </w:r>
-          </w:p>
-        </w:tc>
-        <w:tc>
-          <w:tcPr/>
-          <w:p>
-            <w:pPr>
-              <w:pStyle w:val="Compact"/>
-              <w:jc w:val="left"/>
-            </w:pPr>
-            <w:r>
-              <w:rPr>
-                <w:sz w:val="19"/>
-              </w:rPr>
-              <w:t xml:space="preserve">One working you know goes one pace faster: an hour becomes ten minutes, ten minutes one action</w:t>
-            </w:r>
-          </w:p>
-        </w:tc>
-        <w:tc>
-          <w:tcPr/>
-          <w:p>
-            <w:pPr>
-              <w:pStyle w:val="Compact"/>
-              <w:jc w:val="left"/>
-            </w:pPr>
-            <w:r>
-              <w:rPr>
-                <w:sz w:val="19"/>
-              </w:rPr>
-              <w:t xml:space="preserve">Each working once</w:t>
-            </w:r>
-          </w:p>
-        </w:tc>
-      </w:tr>
-      <w:tr>
-        <w:tc>
-          <w:tcPr/>
-          <w:p>
-            <w:pPr>
-              <w:pStyle w:val="Compact"/>
-              <w:jc w:val="left"/>
-            </w:pPr>
-            <w:r>
-              <w:rPr>
-                <w:b/>
-                <w:sz w:val="19"/>
-              </w:rPr>
-              <w:t xml:space="preserve">Mastery</w:t>
-            </w:r>
-          </w:p>
-        </w:tc>
-        <w:tc>
-          <w:tcPr/>
-          <w:p>
-            <w:pPr>
-              <w:pStyle w:val="Compact"/>
-              <w:jc w:val="left"/>
-            </w:pPr>
-            <w:r>
-              <w:rPr>
-                <w:sz w:val="19"/>
-              </w:rPr>
-              <w:t xml:space="preserve">Your magic skill becomes Expert (+5)</w:t>
-            </w:r>
-          </w:p>
-        </w:tc>
-        <w:tc>
-          <w:tcPr/>
-          <w:p>
-            <w:pPr>
-              <w:pStyle w:val="Compact"/>
-              <w:jc w:val="left"/>
-            </w:pPr>
-            <w:r>
-              <w:rPr>
-                <w:sz w:val="19"/>
-              </w:rPr>
-              <w:t xml:space="preserve">Once, at the end of a long campaign</w:t>
+              <w:t xml:space="preserve">+1 to an attribute</w:t>
+            </w:r>
+          </w:p>
+        </w:tc>
+        <w:tc>
+          <w:tcPr/>
+          <w:p>
+            <w:pPr>
+              <w:pStyle w:val="Compact"/>
+              <w:jc w:val="left"/>
+            </w:pPr>
+            <w:r>
+              <w:rPr>
+                <w:sz w:val="19"/>
+              </w:rPr>
+              <w:t xml:space="preserve">4</w:t>
+            </w:r>
+          </w:p>
+        </w:tc>
+        <w:tc>
+          <w:tcPr/>
+          <w:p>
+            <w:pPr>
+              <w:pStyle w:val="Compact"/>
+              <w:jc w:val="left"/>
+            </w:pPr>
+            <w:r>
+              <w:rPr>
+                <w:sz w:val="19"/>
+              </w:rPr>
+              <w:t xml:space="preserve">Once per attribute; no higher than one above the starting maximum (14, plus any origin bonus)</w:t>
             </w:r>
           </w:p>
         </w:tc>
       </w:tr>
     </w:tbl>
-    <w:bookmarkEnd w:id="65"/>
-    <w:bookmarkEnd w:id="66"/>
-    <w:bookmarkStart w:id="70" w:name="legend-points-and-tracks"/>
-    <w:p>
-      <w:pPr>
-        <w:pStyle w:val="Heading1"/>
-      </w:pPr>
-      <w:r>
-        <w:t xml:space="preserve">Legend points and tracks</w:t>
-      </w:r>
-    </w:p>
-    <w:bookmarkStart w:id="67" w:name="using-legend-points"/>
-    <w:p>
-      <w:pPr>
-        <w:pStyle w:val="Heading2"/>
-      </w:pPr>
-      <w:r>
-        <w:t xml:space="preserve">Using Legend points</w:t>
-      </w:r>
-    </w:p>
-    <w:p>
-      <w:pPr>
-        <w:pStyle w:val="FirstParagraph"/>
-      </w:pPr>
-      <w:r>
-        <w:t xml:space="preserve">Begin each session with two Legend points (three with Extra Legend); unused points do not carry over. Spend no more than one point on a single roll or injury event.</w:t>
-      </w:r>
-    </w:p>
-    <w:tbl>
-      <w:tblPr>
-        <w:tblStyle w:val="Table"/>
-        <w:tblW w:type="pct" w:w="5000"/>
-        <w:tblLook w:firstRow="1" w:lastRow="0" w:firstColumn="0" w:lastColumn="0" w:noHBand="0" w:noVBand="0" w:val="0020"/>
-        <w:jc w:val="start"/>
-        <w:tblBorders>
-          <w:top w:val="single" w:sz="4" w:color="B8C2D3"/>
-          <w:left w:val="single" w:sz="4" w:color="B8C2D3"/>
-          <w:bottom w:val="single" w:sz="4" w:color="B8C2D3"/>
-          <w:right w:val="single" w:sz="4" w:color="B8C2D3"/>
-          <w:insideH w:val="single" w:sz="4" w:color="B8C2D3"/>
-          <w:insideV w:val="single" w:sz="4" w:color="B8C2D3"/>
-        </w:tblBorders>
-      </w:tblPr>
-      <w:tblGrid>
-        <w:gridCol w:w="3960"/>
-        <w:gridCol w:w="3960"/>
-      </w:tblGrid>
-      <w:tr>
-        <w:trPr>
-          <w:tblHeader w:val="true"/>
-        </w:trPr>
-        <w:tc>
-          <w:tcPr>
-            <w:shd w:val="clear" w:fill="E9EEF6"/>
-          </w:tcPr>
-          <w:p>
-            <w:pPr>
-              <w:pStyle w:val="Compact"/>
-              <w:jc w:val="left"/>
-            </w:pPr>
-            <w:r>
-              <w:rPr>
-                <w:b/>
-                <w:sz w:val="19"/>
-              </w:rPr>
-              <w:t xml:space="preserve">Spend one point to</w:t>
-            </w:r>
-          </w:p>
-        </w:tc>
-        <w:tc>
-          <w:tcPr>
-            <w:shd w:val="clear" w:fill="E9EEF6"/>
-          </w:tcPr>
-          <w:p>
-            <w:pPr>
-              <w:pStyle w:val="Compact"/>
-              <w:jc w:val="left"/>
-            </w:pPr>
-            <w:r>
-              <w:rPr>
-                <w:b/>
-                <w:sz w:val="19"/>
-              </w:rPr>
-              <w:t xml:space="preserve">Timing and limits</w:t>
-            </w:r>
-          </w:p>
-        </w:tc>
-      </w:tr>
-      <w:tr>
-        <w:tc>
-          <w:tcPr/>
-          <w:p>
-            <w:pPr>
-              <w:pStyle w:val="Compact"/>
-              <w:jc w:val="left"/>
-            </w:pPr>
-            <w:r>
-              <w:rPr>
-                <w:b/>
-                <w:sz w:val="19"/>
-              </w:rPr>
-              <w:t xml:space="preserve">Reroll your own roll</w:t>
-            </w:r>
-          </w:p>
-        </w:tc>
-        <w:tc>
-          <w:tcPr/>
-          <w:p>
-            <w:pPr>
-              <w:pStyle w:val="Compact"/>
-              <w:jc w:val="left"/>
-            </w:pPr>
-            <w:r>
-              <w:rPr>
-                <w:sz w:val="19"/>
-              </w:rPr>
-              <w:t xml:space="preserve">Declare after seeing the result but before its consequences. Keep the second result, even if worse.</w:t>
-            </w:r>
-          </w:p>
-        </w:tc>
-      </w:tr>
-      <w:tr>
-        <w:tc>
-          <w:tcPr/>
-          <w:p>
-            <w:pPr>
-              <w:pStyle w:val="Compact"/>
-              <w:jc w:val="left"/>
-            </w:pPr>
-            <w:r>
-              <w:rPr>
-                <w:b/>
-                <w:sz w:val="19"/>
-              </w:rPr>
-              <w:t xml:space="preserve">Reduce an injury by one box</w:t>
-            </w:r>
-          </w:p>
-        </w:tc>
-        <w:tc>
-          <w:tcPr/>
-          <w:p>
-            <w:pPr>
-              <w:pStyle w:val="Compact"/>
-              <w:jc w:val="left"/>
-            </w:pPr>
-            <w:r>
-              <w:rPr>
-                <w:sz w:val="19"/>
-              </w:rPr>
-              <w:t xml:space="preserve">Declare when a hit would mark boxes, before applying them. Does not prevent certain death.</w:t>
-            </w:r>
-          </w:p>
-        </w:tc>
-      </w:tr>
-      <w:tr>
-        <w:tc>
-          <w:tcPr/>
-          <w:p>
-            <w:pPr>
-              <w:pStyle w:val="Compact"/>
-              <w:jc w:val="left"/>
-            </w:pPr>
-            <w:r>
-              <w:rPr>
-                <w:b/>
-                <w:sz w:val="19"/>
-              </w:rPr>
-              <w:t xml:space="preserve">Establish a small preparation</w:t>
-            </w:r>
-          </w:p>
-        </w:tc>
-        <w:tc>
-          <w:tcPr/>
-          <w:p>
-            <w:pPr>
-              <w:pStyle w:val="Compact"/>
-              <w:jc w:val="left"/>
-            </w:pPr>
-            <w:r>
-              <w:rPr>
-                <w:sz w:val="19"/>
-              </w:rPr>
-              <w:t xml:space="preserve">Propose a plausible detail, such as having packed something useful. GM approval is required.</w:t>
-            </w:r>
-          </w:p>
-        </w:tc>
-      </w:tr>
-    </w:tbl>
     <w:p>
       <w:pPr>
         <w:pStyle w:val="BodyText"/>
       </w:pPr>
       <w:r>
-        <w:t xml:space="preserve">Gain one point when one of your complications creates a meaningful problem you accept, including a companion complication. You can decline the proposed complication without penalty.</w:t>
-      </w:r>
-    </w:p>
-    <w:bookmarkEnd w:id="67"/>
-    <w:bookmarkStart w:id="68" w:name="tracks"/>
-    <w:p>
-      <w:pPr>
-        <w:pStyle w:val="Heading2"/>
-      </w:pPr>
-      <w:r>
-        <w:t xml:space="preserve">Tracks</w:t>
-      </w:r>
-    </w:p>
-    <w:p>
-      <w:pPr>
-        <w:pStyle w:val="FirstParagraph"/>
-      </w:pPr>
-      <w:r>
-        <w:rPr>
-          <w:iCs/>
-          <w:i/>
-        </w:rPr>
-        <w:t xml:space="preserve">Your setting pack supplies this (tracks).</w:t>
-      </w:r>
-    </w:p>
-    <w:bookmarkEnd w:id="68"/>
-    <w:bookmarkStart w:id="69" w:name="advancement"/>
-    <w:p>
-      <w:pPr>
-        <w:pStyle w:val="Heading2"/>
-      </w:pPr>
-      <w:r>
-        <w:t xml:space="preserve">Advancement</w:t>
-      </w:r>
-    </w:p>
-    <w:p>
-      <w:pPr>
-        <w:pStyle w:val="FirstParagraph"/>
-      </w:pPr>
-      <w:r>
-        <w:t xml:space="preserve">After a significant mission, the GM may authorize one relevant skill to advance from Untrained to Trained or from Trained to Specialty, or allow revision of an advantage or complication. Only a Specialist’s starting skill is Expert; a skill raised later tops out at Specialty (+3) unless they broaden (see Step 3).</w:t>
+        <w:t xml:space="preserve">Magic and powers grow the same way, at the costs their chapters give.</w:t>
       </w:r>
     </w:p>
     <w:bookmarkEnd w:id="69"/>
@@ -5039,250 +5575,6 @@
       </w:pPr>
       <w:r>
         <w:t xml:space="preserve">End each mission with a short entry, written together:</w:t>
-      </w:r>
-    </w:p>
-    <w:p>
-      <w:pPr>
-        <w:numPr>
-          <w:ilvl w:val="0"/>
-          <w:numId w:val="1008"/>
-        </w:numPr>
-        <w:pStyle w:val="Compact"/>
-      </w:pPr>
-      <w:r>
-        <w:rPr>
-          <w:bCs/>
-          <w:b/>
-        </w:rPr>
-        <w:t xml:space="preserve">The mission.</w:t>
-      </w:r>
-      <w:r>
-        <w:t xml:space="preserve"> </w:t>
-      </w:r>
-      <w:r>
-        <w:t xml:space="preserve">What happened, and did we succeed: fully, partly, or not at all?</w:t>
-      </w:r>
-    </w:p>
-    <w:p>
-      <w:pPr>
-        <w:numPr>
-          <w:ilvl w:val="0"/>
-          <w:numId w:val="1008"/>
-        </w:numPr>
-        <w:pStyle w:val="Compact"/>
-      </w:pPr>
-      <w:r>
-        <w:rPr>
-          <w:bCs/>
-          <w:b/>
-        </w:rPr>
-        <w:t xml:space="preserve">Who stood out?</w:t>
-      </w:r>
-      <w:r>
-        <w:t xml:space="preserve"> </w:t>
-      </w:r>
-      <w:r>
-        <w:t xml:space="preserve">A moment worth remembering.</w:t>
-      </w:r>
-    </w:p>
-    <w:p>
-      <w:pPr>
-        <w:numPr>
-          <w:ilvl w:val="0"/>
-          <w:numId w:val="1008"/>
-        </w:numPr>
-        <w:pStyle w:val="Compact"/>
-      </w:pPr>
-      <w:r>
-        <w:rPr>
-          <w:bCs/>
-          <w:b/>
-        </w:rPr>
-        <w:t xml:space="preserve">Complications.</w:t>
-      </w:r>
-      <w:r>
-        <w:t xml:space="preserve"> </w:t>
-      </w:r>
-      <w:r>
-        <w:t xml:space="preserve">Which ones came into play, and what did they cost?</w:t>
-      </w:r>
-    </w:p>
-    <w:p>
-      <w:pPr>
-        <w:numPr>
-          <w:ilvl w:val="0"/>
-          <w:numId w:val="1008"/>
-        </w:numPr>
-        <w:pStyle w:val="Compact"/>
-      </w:pPr>
-      <w:r>
-        <w:rPr>
-          <w:bCs/>
-          <w:b/>
-        </w:rPr>
-        <w:t xml:space="preserve">What changed?</w:t>
-      </w:r>
-      <w:r>
-        <w:t xml:space="preserve"> </w:t>
-      </w:r>
-      <w:r>
-        <w:t xml:space="preserve">New allies or enemies, damage, open threads for next time.</w:t>
-      </w:r>
-    </w:p>
-    <w:p>
-      <w:pPr>
-        <w:numPr>
-          <w:ilvl w:val="0"/>
-          <w:numId w:val="1008"/>
-        </w:numPr>
-        <w:pStyle w:val="Compact"/>
-      </w:pPr>
-      <w:r>
-        <w:rPr>
-          <w:bCs/>
-          <w:b/>
-        </w:rPr>
-        <w:t xml:space="preserve">Advancement.</w:t>
-      </w:r>
-      <w:r>
-        <w:t xml:space="preserve"> </w:t>
-      </w:r>
-      <w:r>
-        <w:t xml:space="preserve">After a significant mission, the GM may authorize one skill step for each character.</w:t>
-      </w:r>
-    </w:p>
-    <w:bookmarkEnd w:id="72"/>
-    <w:bookmarkEnd w:id="73"/>
-    <w:bookmarkStart w:id="74" w:name="ready-made-characters"/>
-    <w:p>
-      <w:pPr>
-        <w:pStyle w:val="Heading1"/>
-      </w:pPr>
-      <w:r>
-        <w:t xml:space="preserve">Ready-made characters</w:t>
-      </w:r>
-    </w:p>
-    <w:p>
-      <w:pPr>
-        <w:pStyle w:val="FirstParagraph"/>
-      </w:pPr>
-      <w:r>
-        <w:t xml:space="preserve">Characters ready to play, for one-shots, new players, or a group in a hurry. Each follows the creation rules exactly, and their connections tie them together. In the creator, choose one from the ready-made list to open it and make it your own.</w:t>
-      </w:r>
-    </w:p>
-    <w:p>
-      <w:pPr>
-        <w:pStyle w:val="BodyText"/>
-      </w:pPr>
-      <w:r>
-        <w:rPr>
-          <w:iCs/>
-          <w:i/>
-        </w:rPr>
-        <w:t xml:space="preserve">Your setting pack supplies this (pregens).</w:t>
-      </w:r>
-    </w:p>
-    <w:bookmarkEnd w:id="74"/>
-    <w:bookmarkStart w:id="75" w:name="advantages"/>
-    <w:p>
-      <w:pPr>
-        <w:pStyle w:val="Heading1"/>
-      </w:pPr>
-      <w:r>
-        <w:t xml:space="preserve">Advantages</w:t>
-      </w:r>
-    </w:p>
-    <w:p>
-      <w:pPr>
-        <w:pStyle w:val="FirstParagraph"/>
-      </w:pPr>
-      <w:r>
-        <w:t xml:space="preserve">Choose one advantage at character creation: a general advantage from this chapter, or an origin advantage from the next. Each grants +2 only in the listed circumstances. An advantage does not grant training, authorize an impossible action, or replace essential gear. Use only one advantage bonus per roll.</w:t>
-      </w:r>
-    </w:p>
-    <w:p>
-      <w:pPr>
-        <w:pStyle w:val="BodyText"/>
-      </w:pPr>
-      <w:r>
-        <w:rPr>
-          <w:iCs/>
-          <w:i/>
-        </w:rPr>
-        <w:t xml:space="preserve">Your setting pack supplies this (advantages).</w:t>
-      </w:r>
-    </w:p>
-    <w:bookmarkEnd w:id="75"/>
-    <w:bookmarkStart w:id="76" w:name="origins"/>
-    <w:p>
-      <w:pPr>
-        <w:pStyle w:val="Heading1"/>
-      </w:pPr>
-      <w:r>
-        <w:t xml:space="preserve">Origins</w:t>
-      </w:r>
-    </w:p>
-    <w:p>
-      <w:pPr>
-        <w:pStyle w:val="FirstParagraph"/>
-      </w:pPr>
-      <w:r>
-        <w:rPr>
-          <w:iCs/>
-          <w:i/>
-        </w:rPr>
-        <w:t xml:space="preserve">Your setting pack supplies this (origins).</w:t>
-      </w:r>
-    </w:p>
-    <w:bookmarkEnd w:id="76"/>
-    <w:bookmarkStart w:id="87" w:name="making-your-own"/>
-    <w:p>
-      <w:pPr>
-        <w:pStyle w:val="Heading1"/>
-      </w:pPr>
-      <w:r>
-        <w:t xml:space="preserve">Making your own</w:t>
-      </w:r>
-    </w:p>
-    <w:p>
-      <w:pPr>
-        <w:pStyle w:val="FirstParagraph"/>
-      </w:pPr>
-      <w:r>
-        <w:t xml:space="preserve">The roles and origins in this book are a starting point, not a limit. With the GM’s agreement, any player can create their own role or origin. The creator has a</w:t>
-      </w:r>
-      <w:r>
-        <w:t xml:space="preserve"> </w:t>
-      </w:r>
-      <w:r>
-        <w:rPr>
-          <w:bCs/>
-          <w:b/>
-        </w:rPr>
-        <w:t xml:space="preserve">Custom</w:t>
-      </w:r>
-      <w:r>
-        <w:t xml:space="preserve"> </w:t>
-      </w:r>
-      <w:r>
-        <w:t xml:space="preserve">option at the end of each list, and its checklist holds a custom choice to the same rules as everything else.</w:t>
-      </w:r>
-    </w:p>
-    <w:bookmarkStart w:id="77" w:name="a-custom-role"/>
-    <w:p>
-      <w:pPr>
-        <w:pStyle w:val="Heading2"/>
-      </w:pPr>
-      <w:r>
-        <w:t xml:space="preserve">A custom role</w:t>
-      </w:r>
-    </w:p>
-    <w:p>
-      <w:pPr>
-        <w:pStyle w:val="FirstParagraph"/>
-      </w:pPr>
-      <w:r>
-        <w:t xml:space="preserve">A role is a concept, not a package of powers: it gives no bonus of its own. A custom one only needs a clear place in the group.</w:t>
       </w:r>
     </w:p>
     <w:p>
@@ -5298,37 +5590,13 @@
           <w:bCs/>
           <w:b/>
         </w:rPr>
-        <w:t xml:space="preserve">Name it and describe it.</w:t>
-      </w:r>
-      <w:r>
-        <w:t xml:space="preserve"> </w:t>
-      </w:r>
-      <w:r>
-        <w:t xml:space="preserve">One sentence for what your character does that no one else does, in the style of the roles above:</w:t>
-      </w:r>
-      <w:r>
-        <w:t xml:space="preserve"> </w:t>
-      </w:r>
-      <w:r>
-        <w:rPr>
-          <w:iCs/>
-          <w:i/>
-        </w:rPr>
-        <w:t xml:space="preserve">“</w:t>
-      </w:r>
-      <w:r>
-        <w:rPr>
-          <w:iCs/>
-          <w:i/>
-        </w:rPr>
-        <w:t xml:space="preserve">Smuggler: knows every back door, bribe and hidden hold.</w:t>
-      </w:r>
-      <w:r>
-        <w:rPr>
-          <w:iCs/>
-          <w:i/>
-        </w:rPr>
-        <w:t xml:space="preserve">”</w:t>
+        <w:t xml:space="preserve">The mission.</w:t>
+      </w:r>
+      <w:r>
+        <w:t xml:space="preserve"> </w:t>
+      </w:r>
+      <w:r>
+        <w:t xml:space="preserve">What happened, and did we succeed: fully, partly, or not at all?</w:t>
       </w:r>
     </w:p>
     <w:p>
@@ -5344,13 +5612,13 @@
           <w:bCs/>
           <w:b/>
         </w:rPr>
-        <w:t xml:space="preserve">Choose a group.</w:t>
-      </w:r>
-      <w:r>
-        <w:t xml:space="preserve"> </w:t>
-      </w:r>
-      <w:r>
-        <w:t xml:space="preserve">Pick the one it belongs with: one of your setting’s groups. The group only sets your sheet’s colors and emblem.</w:t>
+        <w:t xml:space="preserve">Who stood out?</w:t>
+      </w:r>
+      <w:r>
+        <w:t xml:space="preserve"> </w:t>
+      </w:r>
+      <w:r>
+        <w:t xml:space="preserve">A moment worth remembering.</w:t>
       </w:r>
     </w:p>
     <w:p>
@@ -5366,13 +5634,13 @@
           <w:bCs/>
           <w:b/>
         </w:rPr>
-        <w:t xml:space="preserve">Pick four core skills.</w:t>
-      </w:r>
-      <w:r>
-        <w:t xml:space="preserve"> </w:t>
-      </w:r>
-      <w:r>
-        <w:t xml:space="preserve">The skills it can’t do without. Mark them Trained yourself in step 3 (the built-in roles do this for you); they count toward your normal Trained skills.</w:t>
+        <w:t xml:space="preserve">Complications.</w:t>
+      </w:r>
+      <w:r>
+        <w:t xml:space="preserve"> </w:t>
+      </w:r>
+      <w:r>
+        <w:t xml:space="preserve">Which ones came into play, and what did they cost?</w:t>
       </w:r>
     </w:p>
     <w:p>
@@ -5380,6 +5648,274 @@
         <w:numPr>
           <w:ilvl w:val="0"/>
           <w:numId w:val="1009"/>
+        </w:numPr>
+        <w:pStyle w:val="Compact"/>
+      </w:pPr>
+      <w:r>
+        <w:rPr>
+          <w:bCs/>
+          <w:b/>
+        </w:rPr>
+        <w:t xml:space="preserve">What changed?</w:t>
+      </w:r>
+      <w:r>
+        <w:t xml:space="preserve"> </w:t>
+      </w:r>
+      <w:r>
+        <w:t xml:space="preserve">New allies or enemies, damage, open threads for next time.</w:t>
+      </w:r>
+    </w:p>
+    <w:p>
+      <w:pPr>
+        <w:numPr>
+          <w:ilvl w:val="0"/>
+          <w:numId w:val="1009"/>
+        </w:numPr>
+        <w:pStyle w:val="Compact"/>
+      </w:pPr>
+      <w:r>
+        <w:rPr>
+          <w:bCs/>
+          <w:b/>
+        </w:rPr>
+        <w:t xml:space="preserve">Advancement.</w:t>
+      </w:r>
+      <w:r>
+        <w:t xml:space="preserve"> </w:t>
+      </w:r>
+      <w:r>
+        <w:t xml:space="preserve">After a significant mission, each character earns 1 advancement point; at a milestone, 2 more.</w:t>
+      </w:r>
+    </w:p>
+    <w:bookmarkEnd w:id="72"/>
+    <w:bookmarkEnd w:id="73"/>
+    <w:bookmarkStart w:id="74" w:name="ready-made-characters"/>
+    <w:p>
+      <w:pPr>
+        <w:pStyle w:val="Heading1"/>
+      </w:pPr>
+      <w:r>
+        <w:t xml:space="preserve">Ready-made characters</w:t>
+      </w:r>
+    </w:p>
+    <w:p>
+      <w:pPr>
+        <w:pStyle w:val="FirstParagraph"/>
+      </w:pPr>
+      <w:r>
+        <w:t xml:space="preserve">Characters ready to play, for one-shots, new players, or a group in a hurry. Each follows the creation rules exactly, and their connections tie them together. In the creator, choose one from the ready-made list to open it and make it your own.</w:t>
+      </w:r>
+    </w:p>
+    <w:p>
+      <w:pPr>
+        <w:pStyle w:val="BodyText"/>
+      </w:pPr>
+      <w:r>
+        <w:rPr>
+          <w:iCs/>
+          <w:i/>
+        </w:rPr>
+        <w:t xml:space="preserve">Your setting pack supplies this (pregens).</w:t>
+      </w:r>
+    </w:p>
+    <w:bookmarkEnd w:id="74"/>
+    <w:bookmarkStart w:id="75" w:name="advantages"/>
+    <w:p>
+      <w:pPr>
+        <w:pStyle w:val="Heading1"/>
+      </w:pPr>
+      <w:r>
+        <w:t xml:space="preserve">Advantages</w:t>
+      </w:r>
+    </w:p>
+    <w:p>
+      <w:pPr>
+        <w:pStyle w:val="FirstParagraph"/>
+      </w:pPr>
+      <w:r>
+        <w:t xml:space="preserve">Choose one advantage at character creation: a general advantage from this chapter, or an origin advantage from the next. Each grants +2 only in the listed circumstances. An advantage does not grant training, authorize an impossible action, or replace essential gear. Use only one advantage bonus per roll.</w:t>
+      </w:r>
+    </w:p>
+    <w:p>
+      <w:pPr>
+        <w:pStyle w:val="BodyText"/>
+      </w:pPr>
+      <w:r>
+        <w:rPr>
+          <w:iCs/>
+          <w:i/>
+        </w:rPr>
+        <w:t xml:space="preserve">Your setting pack supplies this (advantages).</w:t>
+      </w:r>
+    </w:p>
+    <w:bookmarkEnd w:id="75"/>
+    <w:bookmarkStart w:id="76" w:name="origins"/>
+    <w:p>
+      <w:pPr>
+        <w:pStyle w:val="Heading1"/>
+      </w:pPr>
+      <w:r>
+        <w:t xml:space="preserve">Origins</w:t>
+      </w:r>
+    </w:p>
+    <w:p>
+      <w:pPr>
+        <w:pStyle w:val="FirstParagraph"/>
+      </w:pPr>
+      <w:r>
+        <w:rPr>
+          <w:iCs/>
+          <w:i/>
+        </w:rPr>
+        <w:t xml:space="preserve">Your setting pack supplies this (origins).</w:t>
+      </w:r>
+    </w:p>
+    <w:bookmarkEnd w:id="76"/>
+    <w:bookmarkStart w:id="87" w:name="making-your-own"/>
+    <w:p>
+      <w:pPr>
+        <w:pStyle w:val="Heading1"/>
+      </w:pPr>
+      <w:r>
+        <w:t xml:space="preserve">Making your own</w:t>
+      </w:r>
+    </w:p>
+    <w:p>
+      <w:pPr>
+        <w:pStyle w:val="FirstParagraph"/>
+      </w:pPr>
+      <w:r>
+        <w:t xml:space="preserve">The roles and origins in this book are a starting point, not a limit. With the GM’s agreement, any player can create their own role or origin. The creator has a</w:t>
+      </w:r>
+      <w:r>
+        <w:t xml:space="preserve"> </w:t>
+      </w:r>
+      <w:r>
+        <w:rPr>
+          <w:bCs/>
+          <w:b/>
+        </w:rPr>
+        <w:t xml:space="preserve">Custom</w:t>
+      </w:r>
+      <w:r>
+        <w:t xml:space="preserve"> </w:t>
+      </w:r>
+      <w:r>
+        <w:t xml:space="preserve">option at the end of each list, and its checklist holds a custom choice to the same rules as everything else.</w:t>
+      </w:r>
+    </w:p>
+    <w:bookmarkStart w:id="77" w:name="a-custom-role"/>
+    <w:p>
+      <w:pPr>
+        <w:pStyle w:val="Heading2"/>
+      </w:pPr>
+      <w:r>
+        <w:t xml:space="preserve">A custom role</w:t>
+      </w:r>
+    </w:p>
+    <w:p>
+      <w:pPr>
+        <w:pStyle w:val="FirstParagraph"/>
+      </w:pPr>
+      <w:r>
+        <w:t xml:space="preserve">A role is a concept, not a package of powers: it gives no bonus of its own. A custom one only needs a clear place in the group.</w:t>
+      </w:r>
+    </w:p>
+    <w:p>
+      <w:pPr>
+        <w:numPr>
+          <w:ilvl w:val="0"/>
+          <w:numId w:val="1010"/>
+        </w:numPr>
+        <w:pStyle w:val="Compact"/>
+      </w:pPr>
+      <w:r>
+        <w:rPr>
+          <w:bCs/>
+          <w:b/>
+        </w:rPr>
+        <w:t xml:space="preserve">Name it and describe it.</w:t>
+      </w:r>
+      <w:r>
+        <w:t xml:space="preserve"> </w:t>
+      </w:r>
+      <w:r>
+        <w:t xml:space="preserve">One sentence for what your character does that no one else does, in the style of the roles above:</w:t>
+      </w:r>
+      <w:r>
+        <w:t xml:space="preserve"> </w:t>
+      </w:r>
+      <w:r>
+        <w:rPr>
+          <w:iCs/>
+          <w:i/>
+        </w:rPr>
+        <w:t xml:space="preserve">“</w:t>
+      </w:r>
+      <w:r>
+        <w:rPr>
+          <w:iCs/>
+          <w:i/>
+        </w:rPr>
+        <w:t xml:space="preserve">Smuggler: knows every back door, bribe and hidden hold.</w:t>
+      </w:r>
+      <w:r>
+        <w:rPr>
+          <w:iCs/>
+          <w:i/>
+        </w:rPr>
+        <w:t xml:space="preserve">”</w:t>
+      </w:r>
+    </w:p>
+    <w:p>
+      <w:pPr>
+        <w:numPr>
+          <w:ilvl w:val="0"/>
+          <w:numId w:val="1010"/>
+        </w:numPr>
+        <w:pStyle w:val="Compact"/>
+      </w:pPr>
+      <w:r>
+        <w:rPr>
+          <w:bCs/>
+          <w:b/>
+        </w:rPr>
+        <w:t xml:space="preserve">Choose a group.</w:t>
+      </w:r>
+      <w:r>
+        <w:t xml:space="preserve"> </w:t>
+      </w:r>
+      <w:r>
+        <w:t xml:space="preserve">Pick the one it belongs with: one of your setting’s groups. The group only sets your sheet’s colors and emblem.</w:t>
+      </w:r>
+    </w:p>
+    <w:p>
+      <w:pPr>
+        <w:numPr>
+          <w:ilvl w:val="0"/>
+          <w:numId w:val="1010"/>
+        </w:numPr>
+        <w:pStyle w:val="Compact"/>
+      </w:pPr>
+      <w:r>
+        <w:rPr>
+          <w:bCs/>
+          <w:b/>
+        </w:rPr>
+        <w:t xml:space="preserve">Pick four core skills.</w:t>
+      </w:r>
+      <w:r>
+        <w:t xml:space="preserve"> </w:t>
+      </w:r>
+      <w:r>
+        <w:t xml:space="preserve">The skills it can’t do without. Mark them Trained yourself in step 3 (the built-in roles do this for you); they count toward your normal Trained skills.</w:t>
+      </w:r>
+    </w:p>
+    <w:p>
+      <w:pPr>
+        <w:numPr>
+          <w:ilvl w:val="0"/>
+          <w:numId w:val="1010"/>
         </w:numPr>
         <w:pStyle w:val="Compact"/>
       </w:pPr>
@@ -5946,7 +6482,7 @@
       <w:pPr>
         <w:numPr>
           <w:ilvl w:val="0"/>
-          <w:numId w:val="1010"/>
+          <w:numId w:val="1011"/>
         </w:numPr>
         <w:pStyle w:val="Compact"/>
       </w:pPr>
@@ -5974,7 +6510,7 @@
       <w:pPr>
         <w:numPr>
           <w:ilvl w:val="0"/>
-          <w:numId w:val="1010"/>
+          <w:numId w:val="1011"/>
         </w:numPr>
         <w:pStyle w:val="Compact"/>
       </w:pPr>
@@ -5986,7 +6522,7 @@
       <w:pPr>
         <w:numPr>
           <w:ilvl w:val="0"/>
-          <w:numId w:val="1010"/>
+          <w:numId w:val="1011"/>
         </w:numPr>
         <w:pStyle w:val="Compact"/>
       </w:pPr>
@@ -6014,7 +6550,7 @@
       <w:pPr>
         <w:numPr>
           <w:ilvl w:val="0"/>
-          <w:numId w:val="1010"/>
+          <w:numId w:val="1011"/>
         </w:numPr>
         <w:pStyle w:val="Compact"/>
       </w:pPr>
@@ -6700,34 +7236,7 @@
     </w:lvlOverride>
   </w:num>
   <w:num w:numId="1008">
-    <w:abstractNumId w:val="99411"/>
-    <w:lvlOverride w:ilvl="0">
-      <w:startOverride w:val="1"/>
-    </w:lvlOverride>
-    <w:lvlOverride w:ilvl="1">
-      <w:startOverride w:val="1"/>
-    </w:lvlOverride>
-    <w:lvlOverride w:ilvl="2">
-      <w:startOverride w:val="1"/>
-    </w:lvlOverride>
-    <w:lvlOverride w:ilvl="3">
-      <w:startOverride w:val="1"/>
-    </w:lvlOverride>
-    <w:lvlOverride w:ilvl="4">
-      <w:startOverride w:val="1"/>
-    </w:lvlOverride>
-    <w:lvlOverride w:ilvl="5">
-      <w:startOverride w:val="1"/>
-    </w:lvlOverride>
-    <w:lvlOverride w:ilvl="6">
-      <w:startOverride w:val="1"/>
-    </w:lvlOverride>
-    <w:lvlOverride w:ilvl="7">
-      <w:startOverride w:val="1"/>
-    </w:lvlOverride>
-    <w:lvlOverride w:ilvl="8">
-      <w:startOverride w:val="1"/>
-    </w:lvlOverride>
+    <w:abstractNumId w:val="991"/>
   </w:num>
   <w:num w:numId="1009">
     <w:abstractNumId w:val="99411"/>
@@ -6760,6 +7269,36 @@
     </w:lvlOverride>
   </w:num>
   <w:num w:numId="1010">
+    <w:abstractNumId w:val="99411"/>
+    <w:lvlOverride w:ilvl="0">
+      <w:startOverride w:val="1"/>
+    </w:lvlOverride>
+    <w:lvlOverride w:ilvl="1">
+      <w:startOverride w:val="1"/>
+    </w:lvlOverride>
+    <w:lvlOverride w:ilvl="2">
+      <w:startOverride w:val="1"/>
+    </w:lvlOverride>
+    <w:lvlOverride w:ilvl="3">
+      <w:startOverride w:val="1"/>
+    </w:lvlOverride>
+    <w:lvlOverride w:ilvl="4">
+      <w:startOverride w:val="1"/>
+    </w:lvlOverride>
+    <w:lvlOverride w:ilvl="5">
+      <w:startOverride w:val="1"/>
+    </w:lvlOverride>
+    <w:lvlOverride w:ilvl="6">
+      <w:startOverride w:val="1"/>
+    </w:lvlOverride>
+    <w:lvlOverride w:ilvl="7">
+      <w:startOverride w:val="1"/>
+    </w:lvlOverride>
+    <w:lvlOverride w:ilvl="8">
+      <w:startOverride w:val="1"/>
+    </w:lvlOverride>
+  </w:num>
+  <w:num w:numId="1011">
     <w:abstractNumId w:val="99411"/>
     <w:lvlOverride w:ilvl="0">
       <w:startOverride w:val="1"/>

</xml_diff>

<commit_message>
Rebuild the website with telling hits
Co-Authored-By: Claude Opus 5.5 <noreply@anthropic.com>
Claude-Session: https://claude.ai/code/session_015SADCFzhKijkC2foUmXrpC
</commit_message>
<xml_diff>
--- a/legend-dynamics/site/core-rules/Legend_Dynamics_Core_Rules.docx
+++ b/legend-dynamics/site/core-rules/Legend_Dynamics_Core_Rules.docx
@@ -1111,6 +1111,74 @@
           </w:p>
         </w:tc>
       </w:tr>
+      <w:tr>
+        <w:tc>
+          <w:tcPr/>
+          <w:p>
+            <w:pPr>
+              <w:pStyle w:val="Compact"/>
+              <w:jc w:val="left"/>
+            </w:pPr>
+            <w:r>
+              <w:rPr>
+                <w:b/>
+                <w:sz w:val="19"/>
+              </w:rPr>
+              <w:t xml:space="preserve">Hard to put down</w:t>
+            </w:r>
+          </w:p>
+        </w:tc>
+        <w:tc>
+          <w:tcPr/>
+          <w:p>
+            <w:pPr>
+              <w:pStyle w:val="Compact"/>
+              <w:jc w:val="left"/>
+            </w:pPr>
+            <w:r>
+              <w:rPr>
+                <w:sz w:val="19"/>
+              </w:rPr>
+              <w:t xml:space="preserve">Once per fight, shrug off a telling hit’s effect: you still take its boxes (see</w:t>
+            </w:r>
+            <w:r>
+              <w:rPr>
+                <w:sz w:val="19"/>
+              </w:rPr>
+              <w:t xml:space="preserve"> </w:t>
+            </w:r>
+            <w:r>
+              <w:rPr>
+                <w:iCs/>
+                <w:i/>
+                <w:sz w:val="19"/>
+              </w:rPr>
+              <w:t xml:space="preserve">Telling hits</w:t>
+            </w:r>
+            <w:r>
+              <w:rPr>
+                <w:sz w:val="19"/>
+              </w:rPr>
+              <w:t xml:space="preserve">)</w:t>
+            </w:r>
+          </w:p>
+        </w:tc>
+        <w:tc>
+          <w:tcPr/>
+          <w:p>
+            <w:pPr>
+              <w:pStyle w:val="Compact"/>
+              <w:jc w:val="left"/>
+            </w:pPr>
+            <w:r>
+              <w:rPr>
+                <w:sz w:val="19"/>
+              </w:rPr>
+              <w:t xml:space="preserve">1</w:t>
+            </w:r>
+          </w:p>
+        </w:tc>
+      </w:tr>
     </w:tbl>
     <w:bookmarkEnd w:id="26"/>
     <w:bookmarkStart w:id="27" w:name="spending-points"/>
@@ -2248,7 +2316,7 @@
     </w:p>
     <w:bookmarkEnd w:id="48"/>
     <w:bookmarkEnd w:id="49"/>
-    <w:bookmarkStart w:id="56" w:name="personal-combat"/>
+    <w:bookmarkStart w:id="57" w:name="personal-combat"/>
     <w:p>
       <w:pPr>
         <w:pStyle w:val="Heading1"/>
@@ -2458,11 +2526,484 @@
         <w:pStyle w:val="FirstParagraph"/>
       </w:pPr>
       <w:r>
-        <w:t xml:space="preserve">Solid cover blocks a shot. Partial cover imposes −2 on the attack. Weapon effects apply after a hit survives any defense. Success margin does not increase damage.</w:t>
+        <w:t xml:space="preserve">Solid cover blocks a shot. Partial cover imposes −2 on the attack. Weapon effects apply after a hit survives any defense. Success margin does not increase damage: a great hit decides</w:t>
+      </w:r>
+      <w:r>
+        <w:t xml:space="preserve"> </w:t>
+      </w:r>
+      <w:r>
+        <w:rPr>
+          <w:iCs/>
+          <w:i/>
+        </w:rPr>
+        <w:t xml:space="preserve">what</w:t>
+      </w:r>
+      <w:r>
+        <w:t xml:space="preserve"> </w:t>
+      </w:r>
+      <w:r>
+        <w:t xml:space="preserve">happens instead.</w:t>
       </w:r>
     </w:p>
     <w:bookmarkEnd w:id="51"/>
-    <w:bookmarkStart w:id="52" w:name="range"/>
+    <w:bookmarkStart w:id="52" w:name="telling-hits"/>
+    <w:p>
+      <w:pPr>
+        <w:pStyle w:val="Heading2"/>
+      </w:pPr>
+      <w:r>
+        <w:t xml:space="preserve">Telling hits</w:t>
+      </w:r>
+    </w:p>
+    <w:p>
+      <w:pPr>
+        <w:pStyle w:val="FirstParagraph"/>
+      </w:pPr>
+      <w:r>
+        <w:t xml:space="preserve">A really good shot, or a blow that lands exactly where it was meant to, lets the attacker say what it does.</w:t>
+      </w:r>
+    </w:p>
+    <w:p>
+      <w:pPr>
+        <w:numPr>
+          <w:ilvl w:val="0"/>
+          <w:numId w:val="1006"/>
+        </w:numPr>
+        <w:pStyle w:val="Compact"/>
+      </w:pPr>
+      <w:r>
+        <w:rPr>
+          <w:bCs/>
+          <w:b/>
+        </w:rPr>
+        <w:t xml:space="preserve">A telling hit</w:t>
+      </w:r>
+      <w:r>
+        <w:t xml:space="preserve"> </w:t>
+      </w:r>
+      <w:r>
+        <w:t xml:space="preserve">is an attack that succeeds by</w:t>
+      </w:r>
+      <w:r>
+        <w:t xml:space="preserve"> </w:t>
+      </w:r>
+      <w:r>
+        <w:rPr>
+          <w:bCs/>
+          <w:b/>
+        </w:rPr>
+        <w:t xml:space="preserve">5 or more</w:t>
+      </w:r>
+      <w:r>
+        <w:t xml:space="preserve">, or on a natural 3 or 4, and isn’t stopped by a defense. The attacker picks</w:t>
+      </w:r>
+      <w:r>
+        <w:t xml:space="preserve"> </w:t>
+      </w:r>
+      <w:r>
+        <w:rPr>
+          <w:bCs/>
+          <w:b/>
+        </w:rPr>
+        <w:t xml:space="preserve">one effect</w:t>
+      </w:r>
+      <w:r>
+        <w:t xml:space="preserve"> </w:t>
+      </w:r>
+      <w:r>
+        <w:t xml:space="preserve">below and describes it. The weapon still marks its usual boxes.</w:t>
+      </w:r>
+    </w:p>
+    <w:p>
+      <w:pPr>
+        <w:numPr>
+          <w:ilvl w:val="0"/>
+          <w:numId w:val="1006"/>
+        </w:numPr>
+        <w:pStyle w:val="Compact"/>
+      </w:pPr>
+      <w:r>
+        <w:rPr>
+          <w:bCs/>
+          <w:b/>
+        </w:rPr>
+        <w:t xml:space="preserve">A called shot.</w:t>
+      </w:r>
+      <w:r>
+        <w:t xml:space="preserve"> </w:t>
+      </w:r>
+      <w:r>
+        <w:t xml:space="preserve">Before rolling, name the effect you want and take −2 on the attack, or −4 for a small target (a hand, an eye, a rope, a lock). If the attack hits at all, the effect happens, whatever the margin. An advantage that rewards aiming cuts this penalty by 1.</w:t>
+      </w:r>
+    </w:p>
+    <w:p>
+      <w:pPr>
+        <w:numPr>
+          <w:ilvl w:val="0"/>
+          <w:numId w:val="1006"/>
+        </w:numPr>
+        <w:pStyle w:val="Compact"/>
+      </w:pPr>
+      <w:r>
+        <w:rPr>
+          <w:bCs/>
+          <w:b/>
+        </w:rPr>
+        <w:t xml:space="preserve">Both ways.</w:t>
+      </w:r>
+      <w:r>
+        <w:t xml:space="preserve"> </w:t>
+      </w:r>
+      <w:r>
+        <w:t xml:space="preserve">Opponents land telling hits on characters too.</w:t>
+      </w:r>
+    </w:p>
+    <w:tbl>
+      <w:tblPr>
+        <w:tblStyle w:val="Table"/>
+        <w:tblW w:type="pct" w:w="5000"/>
+        <w:tblLook w:firstRow="1" w:lastRow="0" w:firstColumn="0" w:lastColumn="0" w:noHBand="0" w:noVBand="0" w:val="0020"/>
+        <w:jc w:val="start"/>
+        <w:tblBorders>
+          <w:top w:val="single" w:sz="4" w:color="B8C2D3"/>
+          <w:left w:val="single" w:sz="4" w:color="B8C2D3"/>
+          <w:bottom w:val="single" w:sz="4" w:color="B8C2D3"/>
+          <w:right w:val="single" w:sz="4" w:color="B8C2D3"/>
+          <w:insideH w:val="single" w:sz="4" w:color="B8C2D3"/>
+          <w:insideV w:val="single" w:sz="4" w:color="B8C2D3"/>
+        </w:tblBorders>
+      </w:tblPr>
+      <w:tblGrid>
+        <w:gridCol w:w="3960"/>
+        <w:gridCol w:w="3960"/>
+      </w:tblGrid>
+      <w:tr>
+        <w:trPr>
+          <w:tblHeader w:val="true"/>
+        </w:trPr>
+        <w:tc>
+          <w:tcPr>
+            <w:shd w:val="clear" w:fill="E9EEF6"/>
+          </w:tcPr>
+          <w:p>
+            <w:pPr>
+              <w:pStyle w:val="Compact"/>
+              <w:jc w:val="left"/>
+            </w:pPr>
+            <w:r>
+              <w:rPr>
+                <w:b/>
+                <w:sz w:val="19"/>
+              </w:rPr>
+              <w:t xml:space="preserve">Effect</w:t>
+            </w:r>
+          </w:p>
+        </w:tc>
+        <w:tc>
+          <w:tcPr>
+            <w:shd w:val="clear" w:fill="E9EEF6"/>
+          </w:tcPr>
+          <w:p>
+            <w:pPr>
+              <w:pStyle w:val="Compact"/>
+              <w:jc w:val="left"/>
+            </w:pPr>
+            <w:r>
+              <w:rPr>
+                <w:b/>
+                <w:sz w:val="19"/>
+              </w:rPr>
+              <w:t xml:space="preserve">What happens</w:t>
+            </w:r>
+          </w:p>
+        </w:tc>
+      </w:tr>
+      <w:tr>
+        <w:tc>
+          <w:tcPr/>
+          <w:p>
+            <w:pPr>
+              <w:pStyle w:val="Compact"/>
+              <w:jc w:val="left"/>
+            </w:pPr>
+            <w:r>
+              <w:rPr>
+                <w:b/>
+                <w:sz w:val="19"/>
+              </w:rPr>
+              <w:t xml:space="preserve">Disarm</w:t>
+            </w:r>
+          </w:p>
+        </w:tc>
+        <w:tc>
+          <w:tcPr/>
+          <w:p>
+            <w:pPr>
+              <w:pStyle w:val="Compact"/>
+              <w:jc w:val="left"/>
+            </w:pPr>
+            <w:r>
+              <w:rPr>
+                <w:sz w:val="19"/>
+              </w:rPr>
+              <w:t xml:space="preserve">The weapon or held item drops, or flies a few yards away</w:t>
+            </w:r>
+          </w:p>
+        </w:tc>
+      </w:tr>
+      <w:tr>
+        <w:tc>
+          <w:tcPr/>
+          <w:p>
+            <w:pPr>
+              <w:pStyle w:val="Compact"/>
+              <w:jc w:val="left"/>
+            </w:pPr>
+            <w:r>
+              <w:rPr>
+                <w:b/>
+                <w:sz w:val="19"/>
+              </w:rPr>
+              <w:t xml:space="preserve">Knock down</w:t>
+            </w:r>
+          </w:p>
+        </w:tc>
+        <w:tc>
+          <w:tcPr/>
+          <w:p>
+            <w:pPr>
+              <w:pStyle w:val="Compact"/>
+              <w:jc w:val="left"/>
+            </w:pPr>
+            <w:r>
+              <w:rPr>
+                <w:sz w:val="19"/>
+              </w:rPr>
+              <w:t xml:space="preserve">The target falls prone, or is driven back a few steps</w:t>
+            </w:r>
+          </w:p>
+        </w:tc>
+      </w:tr>
+      <w:tr>
+        <w:tc>
+          <w:tcPr/>
+          <w:p>
+            <w:pPr>
+              <w:pStyle w:val="Compact"/>
+              <w:jc w:val="left"/>
+            </w:pPr>
+            <w:r>
+              <w:rPr>
+                <w:b/>
+                <w:sz w:val="19"/>
+              </w:rPr>
+              <w:t xml:space="preserve">Pin</w:t>
+            </w:r>
+          </w:p>
+        </w:tc>
+        <w:tc>
+          <w:tcPr/>
+          <w:p>
+            <w:pPr>
+              <w:pStyle w:val="Compact"/>
+              <w:jc w:val="left"/>
+            </w:pPr>
+            <w:r>
+              <w:rPr>
+                <w:sz w:val="19"/>
+              </w:rPr>
+              <w:t xml:space="preserve">The target is held, tangled or pinned down: their next action goes to getting free</w:t>
+            </w:r>
+          </w:p>
+        </w:tc>
+      </w:tr>
+      <w:tr>
+        <w:tc>
+          <w:tcPr/>
+          <w:p>
+            <w:pPr>
+              <w:pStyle w:val="Compact"/>
+              <w:jc w:val="left"/>
+            </w:pPr>
+            <w:r>
+              <w:rPr>
+                <w:b/>
+                <w:sz w:val="19"/>
+              </w:rPr>
+              <w:t xml:space="preserve">Rattle</w:t>
+            </w:r>
+          </w:p>
+        </w:tc>
+        <w:tc>
+          <w:tcPr/>
+          <w:p>
+            <w:pPr>
+              <w:pStyle w:val="Compact"/>
+              <w:jc w:val="left"/>
+            </w:pPr>
+            <w:r>
+              <w:rPr>
+                <w:sz w:val="19"/>
+              </w:rPr>
+              <w:t xml:space="preserve">−2 to the target’s next roll</w:t>
+            </w:r>
+          </w:p>
+        </w:tc>
+      </w:tr>
+      <w:tr>
+        <w:tc>
+          <w:tcPr/>
+          <w:p>
+            <w:pPr>
+              <w:pStyle w:val="Compact"/>
+              <w:jc w:val="left"/>
+            </w:pPr>
+            <w:r>
+              <w:rPr>
+                <w:b/>
+                <w:sz w:val="19"/>
+              </w:rPr>
+              <w:t xml:space="preserve">Break gear</w:t>
+            </w:r>
+          </w:p>
+        </w:tc>
+        <w:tc>
+          <w:tcPr/>
+          <w:p>
+            <w:pPr>
+              <w:pStyle w:val="Compact"/>
+              <w:jc w:val="left"/>
+            </w:pPr>
+            <w:r>
+              <w:rPr>
+                <w:sz w:val="19"/>
+              </w:rPr>
+              <w:t xml:space="preserve">A shield, weapon or tool breaks; armor loses 1 protection until it’s repaired</w:t>
+            </w:r>
+          </w:p>
+        </w:tc>
+      </w:tr>
+      <w:tr>
+        <w:tc>
+          <w:tcPr/>
+          <w:p>
+            <w:pPr>
+              <w:pStyle w:val="Compact"/>
+              <w:jc w:val="left"/>
+            </w:pPr>
+            <w:r>
+              <w:rPr>
+                <w:b/>
+                <w:sz w:val="19"/>
+              </w:rPr>
+              <w:t xml:space="preserve">Open them up</w:t>
+            </w:r>
+          </w:p>
+        </w:tc>
+        <w:tc>
+          <w:tcPr/>
+          <w:p>
+            <w:pPr>
+              <w:pStyle w:val="Compact"/>
+              <w:jc w:val="left"/>
+            </w:pPr>
+            <w:r>
+              <w:rPr>
+                <w:sz w:val="19"/>
+              </w:rPr>
+              <w:t xml:space="preserve">The next attack on this target this round gets +2</w:t>
+            </w:r>
+          </w:p>
+        </w:tc>
+      </w:tr>
+      <w:tr>
+        <w:tc>
+          <w:tcPr/>
+          <w:p>
+            <w:pPr>
+              <w:pStyle w:val="Compact"/>
+              <w:jc w:val="left"/>
+            </w:pPr>
+            <w:r>
+              <w:rPr>
+                <w:b/>
+                <w:sz w:val="19"/>
+              </w:rPr>
+              <w:t xml:space="preserve">Precise</w:t>
+            </w:r>
+          </w:p>
+        </w:tc>
+        <w:tc>
+          <w:tcPr/>
+          <w:p>
+            <w:pPr>
+              <w:pStyle w:val="Compact"/>
+              <w:jc w:val="left"/>
+            </w:pPr>
+            <w:r>
+              <w:rPr>
+                <w:sz w:val="19"/>
+              </w:rPr>
+              <w:t xml:space="preserve">You hit exactly what you aimed at: the lantern, the rope, the tire, the hand on the trigger</w:t>
+            </w:r>
+          </w:p>
+        </w:tc>
+      </w:tr>
+    </w:tbl>
+    <w:p>
+      <w:pPr>
+        <w:pStyle w:val="BodyText"/>
+      </w:pPr>
+      <w:r>
+        <w:rPr>
+          <w:bCs/>
+          <w:b/>
+        </w:rPr>
+        <w:t xml:space="preserve">Limits.</w:t>
+      </w:r>
+      <w:r>
+        <w:t xml:space="preserve"> </w:t>
+      </w:r>
+      <w:r>
+        <w:t xml:space="preserve">A telling hit never adds boxes and never gets past a defense. The effect has to make sense: nobody disarms a bear or knocks down a train, and the GM can rule an effect out. Opponents who drop from one hit are already down, so a telling hit against them sets up what comes next, like sending one crashing into another.</w:t>
+      </w:r>
+    </w:p>
+    <w:p>
+      <w:pPr>
+        <w:pStyle w:val="BodyText"/>
+      </w:pPr>
+      <w:r>
+        <w:rPr>
+          <w:bCs/>
+          <w:b/>
+        </w:rPr>
+        <w:t xml:space="preserve">Staying alive.</w:t>
+      </w:r>
+      <w:r>
+        <w:t xml:space="preserve"> </w:t>
+      </w:r>
+      <w:r>
+        <w:t xml:space="preserve">A character on the receiving end can shrug off a telling hit’s effect with</w:t>
+      </w:r>
+      <w:r>
+        <w:t xml:space="preserve"> </w:t>
+      </w:r>
+      <w:r>
+        <w:rPr>
+          <w:bCs/>
+          <w:b/>
+        </w:rPr>
+        <w:t xml:space="preserve">Hard to put down</w:t>
+      </w:r>
+      <w:r>
+        <w:t xml:space="preserve"> </w:t>
+      </w:r>
+      <w:r>
+        <w:t xml:space="preserve">(once per fight) or by spending a Legend point. Either way, they still take the boxes.</w:t>
+      </w:r>
+    </w:p>
+    <w:bookmarkEnd w:id="52"/>
+    <w:bookmarkStart w:id="53" w:name="range"/>
     <w:p>
       <w:pPr>
         <w:pStyle w:val="Heading2"/>
@@ -2828,8 +3369,8 @@
         <w:t xml:space="preserve">Moving: your move each turn covers the Close band. Give up your action to run and you cover Short instead.</w:t>
       </w:r>
     </w:p>
-    <w:bookmarkEnd w:id="52"/>
-    <w:bookmarkStart w:id="54" w:name="injury"/>
+    <w:bookmarkEnd w:id="53"/>
+    <w:bookmarkStart w:id="55" w:name="injury"/>
     <w:p>
       <w:pPr>
         <w:pStyle w:val="Heading2"/>
@@ -3118,7 +3659,7 @@
         <w:t xml:space="preserve">Injury penalties replace each other rather than stacking. They apply to movement, attacks, Dodge, and other tasks the injury physically hinders.</w:t>
       </w:r>
     </w:p>
-    <w:bookmarkStart w:id="53" w:name="dying-and-death"/>
+    <w:bookmarkStart w:id="54" w:name="dying-and-death"/>
     <w:p>
       <w:pPr>
         <w:pStyle w:val="Heading3"/>
@@ -3131,7 +3672,7 @@
       <w:pPr>
         <w:numPr>
           <w:ilvl w:val="0"/>
-          <w:numId w:val="1006"/>
+          <w:numId w:val="1007"/>
         </w:numPr>
         <w:pStyle w:val="Compact"/>
       </w:pPr>
@@ -3182,7 +3723,7 @@
       <w:pPr>
         <w:numPr>
           <w:ilvl w:val="0"/>
-          <w:numId w:val="1006"/>
+          <w:numId w:val="1007"/>
         </w:numPr>
         <w:pStyle w:val="Compact"/>
       </w:pPr>
@@ -3204,7 +3745,7 @@
       <w:pPr>
         <w:numPr>
           <w:ilvl w:val="0"/>
-          <w:numId w:val="1006"/>
+          <w:numId w:val="1007"/>
         </w:numPr>
         <w:pStyle w:val="Compact"/>
       </w:pPr>
@@ -3230,9 +3771,9 @@
         <w:t xml:space="preserve">Your protection is avoiding the hit: a defense (Dodge, Parry or Block), cover, and a Legend point, which reduces a hit by one box.</w:t>
       </w:r>
     </w:p>
-    <w:bookmarkEnd w:id="53"/>
     <w:bookmarkEnd w:id="54"/>
-    <w:bookmarkStart w:id="55" w:name="weapons-and-damage"/>
+    <w:bookmarkEnd w:id="55"/>
+    <w:bookmarkStart w:id="56" w:name="weapons-and-damage"/>
     <w:p>
       <w:pPr>
         <w:pStyle w:val="Heading2"/>
@@ -3274,9 +3815,9 @@
         <w:t xml:space="preserve">Your setting pack supplies this (ammo).</w:t>
       </w:r>
     </w:p>
-    <w:bookmarkEnd w:id="55"/>
     <w:bookmarkEnd w:id="56"/>
-    <w:bookmarkStart w:id="61" w:name="medical-care"/>
+    <w:bookmarkEnd w:id="57"/>
+    <w:bookmarkStart w:id="62" w:name="medical-care"/>
     <w:p>
       <w:pPr>
         <w:pStyle w:val="Heading1"/>
@@ -3285,7 +3826,7 @@
         <w:t xml:space="preserve">Medical care</w:t>
       </w:r>
     </w:p>
-    <w:bookmarkStart w:id="57" w:name="diagnosis-and-stabilization"/>
+    <w:bookmarkStart w:id="58" w:name="diagnosis-and-stabilization"/>
     <w:p>
       <w:pPr>
         <w:pStyle w:val="Heading2"/>
@@ -3302,8 +3843,8 @@
         <w:t xml:space="preserve">Roll Medicine when the diagnosis is uncertain or an urgent treatment decision matters. Emergency stabilization takes one action and a successful Medicine roll with a medical kit. It ends Dying and stops deterioration, but removes no boxes.</w:t>
       </w:r>
     </w:p>
-    <w:bookmarkEnd w:id="57"/>
-    <w:bookmarkStart w:id="58" w:name="field-treatment"/>
+    <w:bookmarkEnd w:id="58"/>
+    <w:bookmarkStart w:id="59" w:name="field-treatment"/>
     <w:p>
       <w:pPr>
         <w:pStyle w:val="Heading2"/>
@@ -3320,8 +3861,8 @@
         <w:t xml:space="preserve">With a medical kit and several uninterrupted minutes, successful Medicine removes one injury box; success by 5 or more removes two. Each injury receives one field-treatment attempt; further attempts need changed circumstances.</w:t>
       </w:r>
     </w:p>
-    <w:bookmarkEnd w:id="58"/>
-    <w:bookmarkStart w:id="59" w:name="proper-care"/>
+    <w:bookmarkEnd w:id="59"/>
+    <w:bookmarkStart w:id="60" w:name="proper-care"/>
     <w:p>
       <w:pPr>
         <w:pStyle w:val="Heading2"/>
@@ -3338,8 +3879,8 @@
         <w:t xml:space="preserve">A proper infirmary grants +2 to Medicine. A successful treatment removes two boxes; success by 5 or more removes three. Allow the time the treatment requires.</w:t>
       </w:r>
     </w:p>
-    <w:bookmarkEnd w:id="59"/>
-    <w:bookmarkStart w:id="60" w:name="natural-recovery"/>
+    <w:bookmarkEnd w:id="60"/>
+    <w:bookmarkStart w:id="61" w:name="natural-recovery"/>
     <w:p>
       <w:pPr>
         <w:pStyle w:val="Heading2"/>
@@ -3372,9 +3913,9 @@
         <w:t xml:space="preserve">of rest clears one injury box. Rest means nothing strenuous. At three boxes, rest alone clears nothing: treatment must clear the first box.</w:t>
       </w:r>
     </w:p>
-    <w:bookmarkEnd w:id="60"/>
     <w:bookmarkEnd w:id="61"/>
-    <w:bookmarkStart w:id="66" w:name="magic"/>
+    <w:bookmarkEnd w:id="62"/>
+    <w:bookmarkStart w:id="67" w:name="magic"/>
     <w:p>
       <w:pPr>
         <w:pStyle w:val="Heading1"/>
@@ -3618,7 +4159,7 @@
         </w:tc>
       </w:tr>
     </w:tbl>
-    <w:bookmarkStart w:id="62" w:name="bursts"/>
+    <w:bookmarkStart w:id="63" w:name="bursts"/>
     <w:p>
       <w:pPr>
         <w:pStyle w:val="Heading2"/>
@@ -3999,8 +4540,8 @@
         <w:t xml:space="preserve">A failed burst marks a box of your setting’s price track; a natural 18 marks two, or something answers that shouldn’t.</w:t>
       </w:r>
     </w:p>
-    <w:bookmarkEnd w:id="62"/>
-    <w:bookmarkStart w:id="63" w:name="workings"/>
+    <w:bookmarkEnd w:id="63"/>
+    <w:bookmarkStart w:id="64" w:name="workings"/>
     <w:p>
       <w:pPr>
         <w:pStyle w:val="Heading2"/>
@@ -4013,7 +4554,7 @@
       <w:pPr>
         <w:numPr>
           <w:ilvl w:val="0"/>
-          <w:numId w:val="1007"/>
+          <w:numId w:val="1008"/>
         </w:numPr>
         <w:pStyle w:val="Compact"/>
       </w:pPr>
@@ -4035,7 +4576,7 @@
       <w:pPr>
         <w:numPr>
           <w:ilvl w:val="0"/>
-          <w:numId w:val="1007"/>
+          <w:numId w:val="1008"/>
         </w:numPr>
         <w:pStyle w:val="Compact"/>
       </w:pPr>
@@ -4057,7 +4598,7 @@
       <w:pPr>
         <w:numPr>
           <w:ilvl w:val="0"/>
-          <w:numId w:val="1007"/>
+          <w:numId w:val="1008"/>
         </w:numPr>
         <w:pStyle w:val="Compact"/>
       </w:pPr>
@@ -4317,8 +4858,8 @@
         <w:t xml:space="preserve">The right materials, hour or place remove one segment.</w:t>
       </w:r>
     </w:p>
-    <w:bookmarkEnd w:id="63"/>
-    <w:bookmarkStart w:id="64" w:name="charms"/>
+    <w:bookmarkEnd w:id="64"/>
+    <w:bookmarkStart w:id="65" w:name="charms"/>
     <w:p>
       <w:pPr>
         <w:pStyle w:val="Heading2"/>
@@ -4348,8 +4889,8 @@
         <w:t xml:space="preserve">. Preparation is how slow magic wins a fast fight.</w:t>
       </w:r>
     </w:p>
-    <w:bookmarkEnd w:id="64"/>
-    <w:bookmarkStart w:id="65" w:name="magic-advancement"/>
+    <w:bookmarkEnd w:id="65"/>
+    <w:bookmarkStart w:id="66" w:name="magic-advancement"/>
     <w:p>
       <w:pPr>
         <w:pStyle w:val="Heading2"/>
@@ -4856,9 +5397,9 @@
         </w:tc>
       </w:tr>
     </w:tbl>
-    <w:bookmarkEnd w:id="65"/>
     <w:bookmarkEnd w:id="66"/>
-    <w:bookmarkStart w:id="70" w:name="legend-points-and-tracks"/>
+    <w:bookmarkEnd w:id="67"/>
+    <w:bookmarkStart w:id="71" w:name="legend-points-and-tracks"/>
     <w:p>
       <w:pPr>
         <w:pStyle w:val="Heading1"/>
@@ -4867,7 +5408,7 @@
         <w:t xml:space="preserve">Legend points and tracks</w:t>
       </w:r>
     </w:p>
-    <w:bookmarkStart w:id="67" w:name="using-legend-points"/>
+    <w:bookmarkStart w:id="68" w:name="using-legend-points"/>
     <w:p>
       <w:pPr>
         <w:pStyle w:val="Heading2"/>
@@ -5023,6 +5564,39 @@
                 <w:b/>
                 <w:sz w:val="19"/>
               </w:rPr>
+              <w:t xml:space="preserve">Shrug off a telling hit</w:t>
+            </w:r>
+          </w:p>
+        </w:tc>
+        <w:tc>
+          <w:tcPr/>
+          <w:p>
+            <w:pPr>
+              <w:pStyle w:val="Compact"/>
+              <w:jc w:val="left"/>
+            </w:pPr>
+            <w:r>
+              <w:rPr>
+                <w:sz w:val="19"/>
+              </w:rPr>
+              <w:t xml:space="preserve">Cancel the effect an attacker picked against you; you still take the boxes.</w:t>
+            </w:r>
+          </w:p>
+        </w:tc>
+      </w:tr>
+      <w:tr>
+        <w:tc>
+          <w:tcPr/>
+          <w:p>
+            <w:pPr>
+              <w:pStyle w:val="Compact"/>
+              <w:jc w:val="left"/>
+            </w:pPr>
+            <w:r>
+              <w:rPr>
+                <w:b/>
+                <w:sz w:val="19"/>
+              </w:rPr>
               <w:t xml:space="preserve">Establish a small preparation</w:t>
             </w:r>
           </w:p>
@@ -5052,8 +5626,8 @@
         <w:t xml:space="preserve">Gain one point when one of your complications creates a meaningful problem you accept, including a companion complication. You can decline the proposed complication without penalty.</w:t>
       </w:r>
     </w:p>
-    <w:bookmarkEnd w:id="67"/>
-    <w:bookmarkStart w:id="68" w:name="tracks"/>
+    <w:bookmarkEnd w:id="68"/>
+    <w:bookmarkStart w:id="69" w:name="tracks"/>
     <w:p>
       <w:pPr>
         <w:pStyle w:val="Heading2"/>
@@ -5074,8 +5648,8 @@
         <w:t xml:space="preserve">Your setting pack supplies this (tracks).</w:t>
       </w:r>
     </w:p>
-    <w:bookmarkEnd w:id="68"/>
-    <w:bookmarkStart w:id="69" w:name="advancement"/>
+    <w:bookmarkEnd w:id="69"/>
+    <w:bookmarkStart w:id="70" w:name="advancement"/>
     <w:p>
       <w:pPr>
         <w:pStyle w:val="Heading2"/>
@@ -5112,7 +5686,7 @@
       <w:pPr>
         <w:numPr>
           <w:ilvl w:val="0"/>
-          <w:numId w:val="1008"/>
+          <w:numId w:val="1009"/>
         </w:numPr>
         <w:pStyle w:val="Compact"/>
       </w:pPr>
@@ -5173,7 +5747,7 @@
       <w:pPr>
         <w:numPr>
           <w:ilvl w:val="0"/>
-          <w:numId w:val="1008"/>
+          <w:numId w:val="1009"/>
         </w:numPr>
         <w:pStyle w:val="Compact"/>
       </w:pPr>
@@ -5519,9 +6093,9 @@
         <w:t xml:space="preserve">Magic and powers grow the same way, at the costs their chapters give.</w:t>
       </w:r>
     </w:p>
-    <w:bookmarkEnd w:id="69"/>
     <w:bookmarkEnd w:id="70"/>
-    <w:bookmarkStart w:id="73" w:name="running-missions"/>
+    <w:bookmarkEnd w:id="71"/>
+    <w:bookmarkStart w:id="74" w:name="running-missions"/>
     <w:p>
       <w:pPr>
         <w:pStyle w:val="Heading1"/>
@@ -5530,7 +6104,7 @@
         <w:t xml:space="preserve">Running missions</w:t>
       </w:r>
     </w:p>
-    <w:bookmarkStart w:id="71" w:name="mission-seeds"/>
+    <w:bookmarkStart w:id="72" w:name="mission-seeds"/>
     <w:p>
       <w:pPr>
         <w:pStyle w:val="Heading2"/>
@@ -5559,8 +6133,8 @@
         <w:t xml:space="preserve">Your setting pack supplies this (seeds).</w:t>
       </w:r>
     </w:p>
-    <w:bookmarkEnd w:id="71"/>
-    <w:bookmarkStart w:id="72" w:name="the-journal"/>
+    <w:bookmarkEnd w:id="72"/>
+    <w:bookmarkStart w:id="73" w:name="the-journal"/>
     <w:p>
       <w:pPr>
         <w:pStyle w:val="Heading2"/>
@@ -5575,250 +6149,6 @@
       </w:pPr>
       <w:r>
         <w:t xml:space="preserve">End each mission with a short entry, written together:</w:t>
-      </w:r>
-    </w:p>
-    <w:p>
-      <w:pPr>
-        <w:numPr>
-          <w:ilvl w:val="0"/>
-          <w:numId w:val="1009"/>
-        </w:numPr>
-        <w:pStyle w:val="Compact"/>
-      </w:pPr>
-      <w:r>
-        <w:rPr>
-          <w:bCs/>
-          <w:b/>
-        </w:rPr>
-        <w:t xml:space="preserve">The mission.</w:t>
-      </w:r>
-      <w:r>
-        <w:t xml:space="preserve"> </w:t>
-      </w:r>
-      <w:r>
-        <w:t xml:space="preserve">What happened, and did we succeed: fully, partly, or not at all?</w:t>
-      </w:r>
-    </w:p>
-    <w:p>
-      <w:pPr>
-        <w:numPr>
-          <w:ilvl w:val="0"/>
-          <w:numId w:val="1009"/>
-        </w:numPr>
-        <w:pStyle w:val="Compact"/>
-      </w:pPr>
-      <w:r>
-        <w:rPr>
-          <w:bCs/>
-          <w:b/>
-        </w:rPr>
-        <w:t xml:space="preserve">Who stood out?</w:t>
-      </w:r>
-      <w:r>
-        <w:t xml:space="preserve"> </w:t>
-      </w:r>
-      <w:r>
-        <w:t xml:space="preserve">A moment worth remembering.</w:t>
-      </w:r>
-    </w:p>
-    <w:p>
-      <w:pPr>
-        <w:numPr>
-          <w:ilvl w:val="0"/>
-          <w:numId w:val="1009"/>
-        </w:numPr>
-        <w:pStyle w:val="Compact"/>
-      </w:pPr>
-      <w:r>
-        <w:rPr>
-          <w:bCs/>
-          <w:b/>
-        </w:rPr>
-        <w:t xml:space="preserve">Complications.</w:t>
-      </w:r>
-      <w:r>
-        <w:t xml:space="preserve"> </w:t>
-      </w:r>
-      <w:r>
-        <w:t xml:space="preserve">Which ones came into play, and what did they cost?</w:t>
-      </w:r>
-    </w:p>
-    <w:p>
-      <w:pPr>
-        <w:numPr>
-          <w:ilvl w:val="0"/>
-          <w:numId w:val="1009"/>
-        </w:numPr>
-        <w:pStyle w:val="Compact"/>
-      </w:pPr>
-      <w:r>
-        <w:rPr>
-          <w:bCs/>
-          <w:b/>
-        </w:rPr>
-        <w:t xml:space="preserve">What changed?</w:t>
-      </w:r>
-      <w:r>
-        <w:t xml:space="preserve"> </w:t>
-      </w:r>
-      <w:r>
-        <w:t xml:space="preserve">New allies or enemies, damage, open threads for next time.</w:t>
-      </w:r>
-    </w:p>
-    <w:p>
-      <w:pPr>
-        <w:numPr>
-          <w:ilvl w:val="0"/>
-          <w:numId w:val="1009"/>
-        </w:numPr>
-        <w:pStyle w:val="Compact"/>
-      </w:pPr>
-      <w:r>
-        <w:rPr>
-          <w:bCs/>
-          <w:b/>
-        </w:rPr>
-        <w:t xml:space="preserve">Advancement.</w:t>
-      </w:r>
-      <w:r>
-        <w:t xml:space="preserve"> </w:t>
-      </w:r>
-      <w:r>
-        <w:t xml:space="preserve">After a significant mission, each character earns 1 advancement point; at a milestone, 2 more.</w:t>
-      </w:r>
-    </w:p>
-    <w:bookmarkEnd w:id="72"/>
-    <w:bookmarkEnd w:id="73"/>
-    <w:bookmarkStart w:id="74" w:name="ready-made-characters"/>
-    <w:p>
-      <w:pPr>
-        <w:pStyle w:val="Heading1"/>
-      </w:pPr>
-      <w:r>
-        <w:t xml:space="preserve">Ready-made characters</w:t>
-      </w:r>
-    </w:p>
-    <w:p>
-      <w:pPr>
-        <w:pStyle w:val="FirstParagraph"/>
-      </w:pPr>
-      <w:r>
-        <w:t xml:space="preserve">Characters ready to play, for one-shots, new players, or a group in a hurry. Each follows the creation rules exactly, and their connections tie them together. In the creator, choose one from the ready-made list to open it and make it your own.</w:t>
-      </w:r>
-    </w:p>
-    <w:p>
-      <w:pPr>
-        <w:pStyle w:val="BodyText"/>
-      </w:pPr>
-      <w:r>
-        <w:rPr>
-          <w:iCs/>
-          <w:i/>
-        </w:rPr>
-        <w:t xml:space="preserve">Your setting pack supplies this (pregens).</w:t>
-      </w:r>
-    </w:p>
-    <w:bookmarkEnd w:id="74"/>
-    <w:bookmarkStart w:id="75" w:name="advantages"/>
-    <w:p>
-      <w:pPr>
-        <w:pStyle w:val="Heading1"/>
-      </w:pPr>
-      <w:r>
-        <w:t xml:space="preserve">Advantages</w:t>
-      </w:r>
-    </w:p>
-    <w:p>
-      <w:pPr>
-        <w:pStyle w:val="FirstParagraph"/>
-      </w:pPr>
-      <w:r>
-        <w:t xml:space="preserve">Choose one advantage at character creation: a general advantage from this chapter, or an origin advantage from the next. Each grants +2 only in the listed circumstances. An advantage does not grant training, authorize an impossible action, or replace essential gear. Use only one advantage bonus per roll.</w:t>
-      </w:r>
-    </w:p>
-    <w:p>
-      <w:pPr>
-        <w:pStyle w:val="BodyText"/>
-      </w:pPr>
-      <w:r>
-        <w:rPr>
-          <w:iCs/>
-          <w:i/>
-        </w:rPr>
-        <w:t xml:space="preserve">Your setting pack supplies this (advantages).</w:t>
-      </w:r>
-    </w:p>
-    <w:bookmarkEnd w:id="75"/>
-    <w:bookmarkStart w:id="76" w:name="origins"/>
-    <w:p>
-      <w:pPr>
-        <w:pStyle w:val="Heading1"/>
-      </w:pPr>
-      <w:r>
-        <w:t xml:space="preserve">Origins</w:t>
-      </w:r>
-    </w:p>
-    <w:p>
-      <w:pPr>
-        <w:pStyle w:val="FirstParagraph"/>
-      </w:pPr>
-      <w:r>
-        <w:rPr>
-          <w:iCs/>
-          <w:i/>
-        </w:rPr>
-        <w:t xml:space="preserve">Your setting pack supplies this (origins).</w:t>
-      </w:r>
-    </w:p>
-    <w:bookmarkEnd w:id="76"/>
-    <w:bookmarkStart w:id="87" w:name="making-your-own"/>
-    <w:p>
-      <w:pPr>
-        <w:pStyle w:val="Heading1"/>
-      </w:pPr>
-      <w:r>
-        <w:t xml:space="preserve">Making your own</w:t>
-      </w:r>
-    </w:p>
-    <w:p>
-      <w:pPr>
-        <w:pStyle w:val="FirstParagraph"/>
-      </w:pPr>
-      <w:r>
-        <w:t xml:space="preserve">The roles and origins in this book are a starting point, not a limit. With the GM’s agreement, any player can create their own role or origin. The creator has a</w:t>
-      </w:r>
-      <w:r>
-        <w:t xml:space="preserve"> </w:t>
-      </w:r>
-      <w:r>
-        <w:rPr>
-          <w:bCs/>
-          <w:b/>
-        </w:rPr>
-        <w:t xml:space="preserve">Custom</w:t>
-      </w:r>
-      <w:r>
-        <w:t xml:space="preserve"> </w:t>
-      </w:r>
-      <w:r>
-        <w:t xml:space="preserve">option at the end of each list, and its checklist holds a custom choice to the same rules as everything else.</w:t>
-      </w:r>
-    </w:p>
-    <w:bookmarkStart w:id="77" w:name="a-custom-role"/>
-    <w:p>
-      <w:pPr>
-        <w:pStyle w:val="Heading2"/>
-      </w:pPr>
-      <w:r>
-        <w:t xml:space="preserve">A custom role</w:t>
-      </w:r>
-    </w:p>
-    <w:p>
-      <w:pPr>
-        <w:pStyle w:val="FirstParagraph"/>
-      </w:pPr>
-      <w:r>
-        <w:t xml:space="preserve">A role is a concept, not a package of powers: it gives no bonus of its own. A custom one only needs a clear place in the group.</w:t>
       </w:r>
     </w:p>
     <w:p>
@@ -5834,37 +6164,13 @@
           <w:bCs/>
           <w:b/>
         </w:rPr>
-        <w:t xml:space="preserve">Name it and describe it.</w:t>
-      </w:r>
-      <w:r>
-        <w:t xml:space="preserve"> </w:t>
-      </w:r>
-      <w:r>
-        <w:t xml:space="preserve">One sentence for what your character does that no one else does, in the style of the roles above:</w:t>
-      </w:r>
-      <w:r>
-        <w:t xml:space="preserve"> </w:t>
-      </w:r>
-      <w:r>
-        <w:rPr>
-          <w:iCs/>
-          <w:i/>
-        </w:rPr>
-        <w:t xml:space="preserve">“</w:t>
-      </w:r>
-      <w:r>
-        <w:rPr>
-          <w:iCs/>
-          <w:i/>
-        </w:rPr>
-        <w:t xml:space="preserve">Smuggler: knows every back door, bribe and hidden hold.</w:t>
-      </w:r>
-      <w:r>
-        <w:rPr>
-          <w:iCs/>
-          <w:i/>
-        </w:rPr>
-        <w:t xml:space="preserve">”</w:t>
+        <w:t xml:space="preserve">The mission.</w:t>
+      </w:r>
+      <w:r>
+        <w:t xml:space="preserve"> </w:t>
+      </w:r>
+      <w:r>
+        <w:t xml:space="preserve">What happened, and did we succeed: fully, partly, or not at all?</w:t>
       </w:r>
     </w:p>
     <w:p>
@@ -5880,13 +6186,13 @@
           <w:bCs/>
           <w:b/>
         </w:rPr>
-        <w:t xml:space="preserve">Choose a group.</w:t>
-      </w:r>
-      <w:r>
-        <w:t xml:space="preserve"> </w:t>
-      </w:r>
-      <w:r>
-        <w:t xml:space="preserve">Pick the one it belongs with: one of your setting’s groups. The group only sets your sheet’s colors and emblem.</w:t>
+        <w:t xml:space="preserve">Who stood out?</w:t>
+      </w:r>
+      <w:r>
+        <w:t xml:space="preserve"> </w:t>
+      </w:r>
+      <w:r>
+        <w:t xml:space="preserve">A moment worth remembering.</w:t>
       </w:r>
     </w:p>
     <w:p>
@@ -5902,13 +6208,13 @@
           <w:bCs/>
           <w:b/>
         </w:rPr>
-        <w:t xml:space="preserve">Pick four core skills.</w:t>
-      </w:r>
-      <w:r>
-        <w:t xml:space="preserve"> </w:t>
-      </w:r>
-      <w:r>
-        <w:t xml:space="preserve">The skills it can’t do without. Mark them Trained yourself in step 3 (the built-in roles do this for you); they count toward your normal Trained skills.</w:t>
+        <w:t xml:space="preserve">Complications.</w:t>
+      </w:r>
+      <w:r>
+        <w:t xml:space="preserve"> </w:t>
+      </w:r>
+      <w:r>
+        <w:t xml:space="preserve">Which ones came into play, and what did they cost?</w:t>
       </w:r>
     </w:p>
     <w:p>
@@ -5924,13 +6230,46 @@
           <w:bCs/>
           <w:b/>
         </w:rPr>
-        <w:t xml:space="preserve">Check it with the GM.</w:t>
-      </w:r>
-      <w:r>
-        <w:t xml:space="preserve"> </w:t>
-      </w:r>
-      <w:r>
-        <w:t xml:space="preserve">It should fit the setting and overlap the existing roles as little as possible.</w:t>
+        <w:t xml:space="preserve">What changed?</w:t>
+      </w:r>
+      <w:r>
+        <w:t xml:space="preserve"> </w:t>
+      </w:r>
+      <w:r>
+        <w:t xml:space="preserve">New allies or enemies, damage, open threads for next time.</w:t>
+      </w:r>
+    </w:p>
+    <w:p>
+      <w:pPr>
+        <w:numPr>
+          <w:ilvl w:val="0"/>
+          <w:numId w:val="1010"/>
+        </w:numPr>
+        <w:pStyle w:val="Compact"/>
+      </w:pPr>
+      <w:r>
+        <w:rPr>
+          <w:bCs/>
+          <w:b/>
+        </w:rPr>
+        <w:t xml:space="preserve">Advancement.</w:t>
+      </w:r>
+      <w:r>
+        <w:t xml:space="preserve"> </w:t>
+      </w:r>
+      <w:r>
+        <w:t xml:space="preserve">After a significant mission, each character earns 1 advancement point; at a milestone, 2 more.</w:t>
+      </w:r>
+    </w:p>
+    <w:bookmarkEnd w:id="73"/>
+    <w:bookmarkEnd w:id="74"/>
+    <w:bookmarkStart w:id="75" w:name="ready-made-characters"/>
+    <w:p>
+      <w:pPr>
+        <w:pStyle w:val="Heading1"/>
+      </w:pPr>
+      <w:r>
+        <w:t xml:space="preserve">Ready-made characters</w:t>
       </w:r>
     </w:p>
     <w:p>
@@ -5938,50 +6277,285 @@
         <w:pStyle w:val="FirstParagraph"/>
       </w:pPr>
       <w:r>
-        <w:rPr>
-          <w:bCs/>
-          <w:b/>
-        </w:rPr>
-        <w:t xml:space="preserve">In the creator:</w:t>
-      </w:r>
-      <w:r>
-        <w:t xml:space="preserve"> </w:t>
-      </w:r>
-      <w:r>
-        <w:t xml:space="preserve">in step 1, choose</w:t>
-      </w:r>
-      <w:r>
-        <w:t xml:space="preserve"> </w:t>
-      </w:r>
-      <w:r>
-        <w:rPr>
-          <w:bCs/>
-          <w:b/>
-        </w:rPr>
-        <w:t xml:space="preserve">Custom role…</w:t>
-      </w:r>
-      <w:r>
-        <w:t xml:space="preserve"> </w:t>
-      </w:r>
-      <w:r>
-        <w:t xml:space="preserve">at the end of the Role list, then enter its name and group. Write the description in</w:t>
-      </w:r>
-      <w:r>
-        <w:t xml:space="preserve"> </w:t>
-      </w:r>
+        <w:t xml:space="preserve">Characters ready to play, for one-shots, new players, or a group in a hurry. Each follows the creation rules exactly, and their connections tie them together. In the creator, choose one from the ready-made list to open it and make it your own.</w:t>
+      </w:r>
+    </w:p>
+    <w:p>
+      <w:pPr>
+        <w:pStyle w:val="BodyText"/>
+      </w:pPr>
       <w:r>
         <w:rPr>
           <w:iCs/>
           <w:i/>
         </w:rPr>
+        <w:t xml:space="preserve">Your setting pack supplies this (pregens).</w:t>
+      </w:r>
+    </w:p>
+    <w:bookmarkEnd w:id="75"/>
+    <w:bookmarkStart w:id="76" w:name="advantages"/>
+    <w:p>
+      <w:pPr>
+        <w:pStyle w:val="Heading1"/>
+      </w:pPr>
+      <w:r>
+        <w:t xml:space="preserve">Advantages</w:t>
+      </w:r>
+    </w:p>
+    <w:p>
+      <w:pPr>
+        <w:pStyle w:val="FirstParagraph"/>
+      </w:pPr>
+      <w:r>
+        <w:t xml:space="preserve">Choose one advantage at character creation: a general advantage from this chapter, or an origin advantage from the next. Each grants +2 only in the listed circumstances. An advantage does not grant training, authorize an impossible action, or replace essential gear. Use only one advantage bonus per roll.</w:t>
+      </w:r>
+    </w:p>
+    <w:p>
+      <w:pPr>
+        <w:pStyle w:val="BodyText"/>
+      </w:pPr>
+      <w:r>
+        <w:rPr>
+          <w:iCs/>
+          <w:i/>
+        </w:rPr>
+        <w:t xml:space="preserve">Your setting pack supplies this (advantages).</w:t>
+      </w:r>
+    </w:p>
+    <w:bookmarkEnd w:id="76"/>
+    <w:bookmarkStart w:id="77" w:name="origins"/>
+    <w:p>
+      <w:pPr>
+        <w:pStyle w:val="Heading1"/>
+      </w:pPr>
+      <w:r>
+        <w:t xml:space="preserve">Origins</w:t>
+      </w:r>
+    </w:p>
+    <w:p>
+      <w:pPr>
+        <w:pStyle w:val="FirstParagraph"/>
+      </w:pPr>
+      <w:r>
+        <w:rPr>
+          <w:iCs/>
+          <w:i/>
+        </w:rPr>
+        <w:t xml:space="preserve">Your setting pack supplies this (origins).</w:t>
+      </w:r>
+    </w:p>
+    <w:bookmarkEnd w:id="77"/>
+    <w:bookmarkStart w:id="88" w:name="making-your-own"/>
+    <w:p>
+      <w:pPr>
+        <w:pStyle w:val="Heading1"/>
+      </w:pPr>
+      <w:r>
+        <w:t xml:space="preserve">Making your own</w:t>
+      </w:r>
+    </w:p>
+    <w:p>
+      <w:pPr>
+        <w:pStyle w:val="FirstParagraph"/>
+      </w:pPr>
+      <w:r>
+        <w:t xml:space="preserve">The roles and origins in this book are a starting point, not a limit. With the GM’s agreement, any player can create their own role or origin. The creator has a</w:t>
+      </w:r>
+      <w:r>
+        <w:t xml:space="preserve"> </w:t>
+      </w:r>
+      <w:r>
+        <w:rPr>
+          <w:bCs/>
+          <w:b/>
+        </w:rPr>
+        <w:t xml:space="preserve">Custom</w:t>
+      </w:r>
+      <w:r>
+        <w:t xml:space="preserve"> </w:t>
+      </w:r>
+      <w:r>
+        <w:t xml:space="preserve">option at the end of each list, and its checklist holds a custom choice to the same rules as everything else.</w:t>
+      </w:r>
+    </w:p>
+    <w:bookmarkStart w:id="78" w:name="a-custom-role"/>
+    <w:p>
+      <w:pPr>
+        <w:pStyle w:val="Heading2"/>
+      </w:pPr>
+      <w:r>
+        <w:t xml:space="preserve">A custom role</w:t>
+      </w:r>
+    </w:p>
+    <w:p>
+      <w:pPr>
+        <w:pStyle w:val="FirstParagraph"/>
+      </w:pPr>
+      <w:r>
+        <w:t xml:space="preserve">A role is a concept, not a package of powers: it gives no bonus of its own. A custom one only needs a clear place in the group.</w:t>
+      </w:r>
+    </w:p>
+    <w:p>
+      <w:pPr>
+        <w:numPr>
+          <w:ilvl w:val="0"/>
+          <w:numId w:val="1011"/>
+        </w:numPr>
+        <w:pStyle w:val="Compact"/>
+      </w:pPr>
+      <w:r>
+        <w:rPr>
+          <w:bCs/>
+          <w:b/>
+        </w:rPr>
+        <w:t xml:space="preserve">Name it and describe it.</w:t>
+      </w:r>
+      <w:r>
+        <w:t xml:space="preserve"> </w:t>
+      </w:r>
+      <w:r>
+        <w:t xml:space="preserve">One sentence for what your character does that no one else does, in the style of the roles above:</w:t>
+      </w:r>
+      <w:r>
+        <w:t xml:space="preserve"> </w:t>
+      </w:r>
+      <w:r>
+        <w:rPr>
+          <w:iCs/>
+          <w:i/>
+        </w:rPr>
+        <w:t xml:space="preserve">“</w:t>
+      </w:r>
+      <w:r>
+        <w:rPr>
+          <w:iCs/>
+          <w:i/>
+        </w:rPr>
+        <w:t xml:space="preserve">Smuggler: knows every back door, bribe and hidden hold.</w:t>
+      </w:r>
+      <w:r>
+        <w:rPr>
+          <w:iCs/>
+          <w:i/>
+        </w:rPr>
+        <w:t xml:space="preserve">”</w:t>
+      </w:r>
+    </w:p>
+    <w:p>
+      <w:pPr>
+        <w:numPr>
+          <w:ilvl w:val="0"/>
+          <w:numId w:val="1011"/>
+        </w:numPr>
+        <w:pStyle w:val="Compact"/>
+      </w:pPr>
+      <w:r>
+        <w:rPr>
+          <w:bCs/>
+          <w:b/>
+        </w:rPr>
+        <w:t xml:space="preserve">Choose a group.</w:t>
+      </w:r>
+      <w:r>
+        <w:t xml:space="preserve"> </w:t>
+      </w:r>
+      <w:r>
+        <w:t xml:space="preserve">Pick the one it belongs with: one of your setting’s groups. The group only sets your sheet’s colors and emblem.</w:t>
+      </w:r>
+    </w:p>
+    <w:p>
+      <w:pPr>
+        <w:numPr>
+          <w:ilvl w:val="0"/>
+          <w:numId w:val="1011"/>
+        </w:numPr>
+        <w:pStyle w:val="Compact"/>
+      </w:pPr>
+      <w:r>
+        <w:rPr>
+          <w:bCs/>
+          <w:b/>
+        </w:rPr>
+        <w:t xml:space="preserve">Pick four core skills.</w:t>
+      </w:r>
+      <w:r>
+        <w:t xml:space="preserve"> </w:t>
+      </w:r>
+      <w:r>
+        <w:t xml:space="preserve">The skills it can’t do without. Mark them Trained yourself in step 3 (the built-in roles do this for you); they count toward your normal Trained skills.</w:t>
+      </w:r>
+    </w:p>
+    <w:p>
+      <w:pPr>
+        <w:numPr>
+          <w:ilvl w:val="0"/>
+          <w:numId w:val="1011"/>
+        </w:numPr>
+        <w:pStyle w:val="Compact"/>
+      </w:pPr>
+      <w:r>
+        <w:rPr>
+          <w:bCs/>
+          <w:b/>
+        </w:rPr>
+        <w:t xml:space="preserve">Check it with the GM.</w:t>
+      </w:r>
+      <w:r>
+        <w:t xml:space="preserve"> </w:t>
+      </w:r>
+      <w:r>
+        <w:t xml:space="preserve">It should fit the setting and overlap the existing roles as little as possible.</w:t>
+      </w:r>
+    </w:p>
+    <w:p>
+      <w:pPr>
+        <w:pStyle w:val="FirstParagraph"/>
+      </w:pPr>
+      <w:r>
+        <w:rPr>
+          <w:bCs/>
+          <w:b/>
+        </w:rPr>
+        <w:t xml:space="preserve">In the creator:</w:t>
+      </w:r>
+      <w:r>
+        <w:t xml:space="preserve"> </w:t>
+      </w:r>
+      <w:r>
+        <w:t xml:space="preserve">in step 1, choose</w:t>
+      </w:r>
+      <w:r>
+        <w:t xml:space="preserve"> </w:t>
+      </w:r>
+      <w:r>
+        <w:rPr>
+          <w:bCs/>
+          <w:b/>
+        </w:rPr>
+        <w:t xml:space="preserve">Custom role…</w:t>
+      </w:r>
+      <w:r>
+        <w:t xml:space="preserve"> </w:t>
+      </w:r>
+      <w:r>
+        <w:t xml:space="preserve">at the end of the Role list, then enter its name and group. Write the description in</w:t>
+      </w:r>
+      <w:r>
+        <w:t xml:space="preserve"> </w:t>
+      </w:r>
+      <w:r>
+        <w:rPr>
+          <w:iCs/>
+          <w:i/>
+        </w:rPr>
         <w:t xml:space="preserve">What you bring</w:t>
       </w:r>
       <w:r>
         <w:t xml:space="preserve">.</w:t>
       </w:r>
     </w:p>
-    <w:bookmarkEnd w:id="77"/>
-    <w:bookmarkStart w:id="86" w:name="a-custom-origin"/>
+    <w:bookmarkEnd w:id="78"/>
+    <w:bookmarkStart w:id="87" w:name="a-custom-origin"/>
     <w:p>
       <w:pPr>
         <w:pStyle w:val="Heading2"/>
@@ -5998,7 +6572,7 @@
         <w:t xml:space="preserve">Build it with the GM, one step at a time.</w:t>
       </w:r>
     </w:p>
-    <w:bookmarkStart w:id="78" w:name="the-concept"/>
+    <w:bookmarkStart w:id="79" w:name="the-concept"/>
     <w:p>
       <w:pPr>
         <w:pStyle w:val="Heading3"/>
@@ -6015,8 +6589,8 @@
         <w:t xml:space="preserve">Two or three sentences: where they come from, what sets them apart, and how others see them. It should be something the origins in this book don’t already cover.</w:t>
       </w:r>
     </w:p>
-    <w:bookmarkEnd w:id="78"/>
-    <w:bookmarkStart w:id="79" w:name="the-tier"/>
+    <w:bookmarkEnd w:id="79"/>
+    <w:bookmarkStart w:id="80" w:name="the-tier"/>
     <w:p>
       <w:pPr>
         <w:pStyle w:val="Heading3"/>
@@ -6313,8 +6887,8 @@
         <w:t xml:space="preserve">When in doubt, choose the higher tier.</w:t>
       </w:r>
     </w:p>
-    <w:bookmarkEnd w:id="79"/>
-    <w:bookmarkStart w:id="80" w:name="attribute-adjustments"/>
+    <w:bookmarkEnd w:id="80"/>
+    <w:bookmarkStart w:id="81" w:name="attribute-adjustments"/>
     <w:p>
       <w:pPr>
         <w:pStyle w:val="Heading3"/>
@@ -6360,8 +6934,8 @@
         <w:t xml:space="preserve">: a +2 needs a −2 or two −1s. The adjustments move the attribute’s base (+1 starts it at 11) and raise its starting maximum (13 plus the bonus). Most origins change two to four attributes.</w:t>
       </w:r>
     </w:p>
-    <w:bookmarkEnd w:id="80"/>
-    <w:bookmarkStart w:id="81" w:name="core-rules-tier-1-and-up"/>
+    <w:bookmarkEnd w:id="81"/>
+    <w:bookmarkStart w:id="82" w:name="core-rules-tier-1-and-up"/>
     <w:p>
       <w:pPr>
         <w:pStyle w:val="Heading3"/>
@@ -6378,8 +6952,8 @@
         <w:t xml:space="preserve">One to three short rules that always apply: what they can do (see in the dark, resist cold, a free Trained skill) and what it costs (a weakness, a people’s distrust, a hazard they can’t abide). A strength with no drawback is worth more than it looks, so price it a tier higher.</w:t>
       </w:r>
     </w:p>
-    <w:bookmarkEnd w:id="81"/>
-    <w:bookmarkStart w:id="82" w:name="origin-advantages"/>
+    <w:bookmarkEnd w:id="82"/>
+    <w:bookmarkStart w:id="83" w:name="origin-advantages"/>
     <w:p>
       <w:pPr>
         <w:pStyle w:val="Heading3"/>
@@ -6434,8 +7008,8 @@
         <w:t xml:space="preserve">: a problem the trait causes, with a clear trigger and a real consequence, which earns a Legend point when it bites, like any complication. A character takes one advantage, general or origin, so make them distinct choices.</w:t>
       </w:r>
     </w:p>
-    <w:bookmarkEnd w:id="82"/>
-    <w:bookmarkStart w:id="83" w:name="an-alternate-form-optional-tier-2-or-3"/>
+    <w:bookmarkEnd w:id="83"/>
+    <w:bookmarkStart w:id="84" w:name="an-alternate-form-optional-tier-2-or-3"/>
     <w:p>
       <w:pPr>
         <w:pStyle w:val="Heading3"/>
@@ -6468,8 +7042,8 @@
         <w:t xml:space="preserve">apply.</w:t>
       </w:r>
     </w:p>
-    <w:bookmarkEnd w:id="83"/>
-    <w:bookmarkStart w:id="84" w:name="in-the-creator"/>
+    <w:bookmarkEnd w:id="84"/>
+    <w:bookmarkStart w:id="85" w:name="in-the-creator"/>
     <w:p>
       <w:pPr>
         <w:pStyle w:val="Heading3"/>
@@ -6482,7 +7056,7 @@
       <w:pPr>
         <w:numPr>
           <w:ilvl w:val="0"/>
-          <w:numId w:val="1011"/>
+          <w:numId w:val="1012"/>
         </w:numPr>
         <w:pStyle w:val="Compact"/>
       </w:pPr>
@@ -6510,7 +7084,7 @@
       <w:pPr>
         <w:numPr>
           <w:ilvl w:val="0"/>
-          <w:numId w:val="1011"/>
+          <w:numId w:val="1012"/>
         </w:numPr>
         <w:pStyle w:val="Compact"/>
       </w:pPr>
@@ -6522,7 +7096,7 @@
       <w:pPr>
         <w:numPr>
           <w:ilvl w:val="0"/>
-          <w:numId w:val="1011"/>
+          <w:numId w:val="1012"/>
         </w:numPr>
         <w:pStyle w:val="Compact"/>
       </w:pPr>
@@ -6550,7 +7124,7 @@
       <w:pPr>
         <w:numPr>
           <w:ilvl w:val="0"/>
-          <w:numId w:val="1011"/>
+          <w:numId w:val="1012"/>
         </w:numPr>
         <w:pStyle w:val="Compact"/>
       </w:pPr>
@@ -6574,8 +7148,8 @@
         <w:t xml:space="preserve">and enter the advantage and its companion complication.</w:t>
       </w:r>
     </w:p>
-    <w:bookmarkEnd w:id="84"/>
-    <w:bookmarkStart w:id="85" w:name="example"/>
+    <w:bookmarkEnd w:id="85"/>
+    <w:bookmarkStart w:id="86" w:name="example"/>
     <w:p>
       <w:pPr>
         <w:pStyle w:val="Heading3"/>
@@ -6680,10 +7254,10 @@
         <w:t xml:space="preserve">: you trust your own people first; when it matters, accept the cost of that loyalty.</w:t>
       </w:r>
     </w:p>
-    <w:bookmarkEnd w:id="85"/>
     <w:bookmarkEnd w:id="86"/>
     <w:bookmarkEnd w:id="87"/>
-    <w:bookmarkStart w:id="88" w:name="complications"/>
+    <w:bookmarkEnd w:id="88"/>
+    <w:bookmarkStart w:id="89" w:name="complications"/>
     <w:p>
       <w:pPr>
         <w:pStyle w:val="Heading1"/>
@@ -6712,8 +7286,8 @@
         <w:t xml:space="preserve">Your setting pack supplies this (complications).</w:t>
       </w:r>
     </w:p>
-    <w:bookmarkEnd w:id="88"/>
-    <w:bookmarkStart w:id="90" w:name="quick-reference"/>
+    <w:bookmarkEnd w:id="89"/>
+    <w:bookmarkStart w:id="91" w:name="quick-reference"/>
     <w:p>
       <w:pPr>
         <w:pStyle w:val="Heading1"/>
@@ -6845,7 +7419,7 @@
         <w:t xml:space="preserve"> </w:t>
       </w:r>
       <w:r>
-        <w:t xml:space="preserve">move plus one action. Hit → one defense a round (Dodge, Parry or Block; −1 to −3 against a clean hit) → weapon effect. Dodge = Agility −2 plus Athletics training (+0, +1, +2). Parry −3, Block −2 plus the shield. Aim: +1. A 2-box weapon that brings you to three boxes leaves you Dying; at three boxes, another 2-box hit kills.</w:t>
+        <w:t xml:space="preserve">move plus one action. Hit → one defense a round (Dodge, Parry or Block; −1 to −3 against a clean hit) → weapon effect. Dodge = Agility −2 plus Athletics training (+0, +1, +2). Parry −3, Block −2 plus the shield. Aim: +1. Telling hit (by 5+ or natural 3–4): the attacker picks an effect; called shot −2 (small target −4). A 2-box weapon that brings you to three boxes leaves you Dying; at three boxes, another 2-box hit kills.</w:t>
       </w:r>
     </w:p>
     <w:p>
@@ -6881,7 +7455,7 @@
         <w:t xml:space="preserve"> </w:t>
       </w:r>
       <w:r>
-        <w:t xml:space="preserve">start each session with two. Reroll, reduce an injury by one box, or establish a small preparation. Earn one from an accepted complication.</w:t>
+        <w:t xml:space="preserve">start each session with two. Reroll, reduce an injury by one box, shrug off a telling hit, or establish a small preparation. Earn one from an accepted complication.</w:t>
       </w:r>
     </w:p>
     <w:p>
@@ -6904,7 +7478,7 @@
       <w:r>
         <w:t xml:space="preserve"> </w:t>
       </w:r>
-      <w:hyperlink r:id="rId89">
+      <w:hyperlink r:id="rId90">
         <w:r>
           <w:rPr>
             <w:rStyle w:val="Hyperlink"/>
@@ -6916,7 +7490,7 @@
         <w:t xml:space="preserve">. You may share, adapt, and use it for any purpose, including commercially, as long as you give appropriate credit to the author.</w:t>
       </w:r>
     </w:p>
-    <w:bookmarkEnd w:id="90"/>
+    <w:bookmarkEnd w:id="91"/>
     <w:sectPr/>
   </w:body>
 </w:document>
@@ -7206,6 +7780,9 @@
     <w:abstractNumId w:val="991"/>
   </w:num>
   <w:num w:numId="1007">
+    <w:abstractNumId w:val="991"/>
+  </w:num>
+  <w:num w:numId="1008">
     <w:abstractNumId w:val="99411"/>
     <w:lvlOverride w:ilvl="0">
       <w:startOverride w:val="1"/>
@@ -7235,38 +7812,8 @@
       <w:startOverride w:val="1"/>
     </w:lvlOverride>
   </w:num>
-  <w:num w:numId="1008">
+  <w:num w:numId="1009">
     <w:abstractNumId w:val="991"/>
-  </w:num>
-  <w:num w:numId="1009">
-    <w:abstractNumId w:val="99411"/>
-    <w:lvlOverride w:ilvl="0">
-      <w:startOverride w:val="1"/>
-    </w:lvlOverride>
-    <w:lvlOverride w:ilvl="1">
-      <w:startOverride w:val="1"/>
-    </w:lvlOverride>
-    <w:lvlOverride w:ilvl="2">
-      <w:startOverride w:val="1"/>
-    </w:lvlOverride>
-    <w:lvlOverride w:ilvl="3">
-      <w:startOverride w:val="1"/>
-    </w:lvlOverride>
-    <w:lvlOverride w:ilvl="4">
-      <w:startOverride w:val="1"/>
-    </w:lvlOverride>
-    <w:lvlOverride w:ilvl="5">
-      <w:startOverride w:val="1"/>
-    </w:lvlOverride>
-    <w:lvlOverride w:ilvl="6">
-      <w:startOverride w:val="1"/>
-    </w:lvlOverride>
-    <w:lvlOverride w:ilvl="7">
-      <w:startOverride w:val="1"/>
-    </w:lvlOverride>
-    <w:lvlOverride w:ilvl="8">
-      <w:startOverride w:val="1"/>
-    </w:lvlOverride>
   </w:num>
   <w:num w:numId="1010">
     <w:abstractNumId w:val="99411"/>
@@ -7299,6 +7846,36 @@
     </w:lvlOverride>
   </w:num>
   <w:num w:numId="1011">
+    <w:abstractNumId w:val="99411"/>
+    <w:lvlOverride w:ilvl="0">
+      <w:startOverride w:val="1"/>
+    </w:lvlOverride>
+    <w:lvlOverride w:ilvl="1">
+      <w:startOverride w:val="1"/>
+    </w:lvlOverride>
+    <w:lvlOverride w:ilvl="2">
+      <w:startOverride w:val="1"/>
+    </w:lvlOverride>
+    <w:lvlOverride w:ilvl="3">
+      <w:startOverride w:val="1"/>
+    </w:lvlOverride>
+    <w:lvlOverride w:ilvl="4">
+      <w:startOverride w:val="1"/>
+    </w:lvlOverride>
+    <w:lvlOverride w:ilvl="5">
+      <w:startOverride w:val="1"/>
+    </w:lvlOverride>
+    <w:lvlOverride w:ilvl="6">
+      <w:startOverride w:val="1"/>
+    </w:lvlOverride>
+    <w:lvlOverride w:ilvl="7">
+      <w:startOverride w:val="1"/>
+    </w:lvlOverride>
+    <w:lvlOverride w:ilvl="8">
+      <w:startOverride w:val="1"/>
+    </w:lvlOverride>
+  </w:num>
+  <w:num w:numId="1012">
     <w:abstractNumId w:val="99411"/>
     <w:lvlOverride w:ilvl="0">
       <w:startOverride w:val="1"/>

</xml_diff>